<commit_message>
Expand AIP protocols template to 5 pre-categorized pages
PIP coordinators were going to have to manually duplicate the
1-page template 5 times. Replaced with a 5-page version where each
page is pre-categorized (Conectividad, Accesos/Contraseñas, Equipos,
Evaluaciones, Escalamiento), the relevant checkbox is pre-marked,
and each page includes a concrete example of the kind of situation
that category should cover. Footer shows "Página N de 5".

Updated the productos card copy: removed "Haz 5 copias" and
replaced with "documento de 5 páginas, una por categoría, lista
para imprimir o completar digital. Cada página viene con la
categoría ya marcada y un ejemplo de la situación que cubre".

Co-Authored-By: Claude Opus 4.7 (1M context) <noreply@anthropic.com>
</commit_message>
<xml_diff>
--- a/certificacion/docs/Formato_Registro_Incidencias_Tecnicas.docx
+++ b/certificacion/docs/Formato_Registro_Incidencias_Tecnicas.docx
@@ -25,7 +25,7 @@
               <w:rPr>
                 <w:b/>
                 <w:color w:val="FFFFFF"/>
-                <w:sz w:val="28"/>
+                <w:sz w:val="26"/>
               </w:rPr>
               <w:t>FORMATO DE REGISTRO DE INCIDENCIAS TÉCNICAS</w:t>
             </w:r>
@@ -40,7 +40,7 @@
                 <w:color w:val="FFFFFF"/>
                 <w:sz w:val="20"/>
               </w:rPr>
-              <w:t>Programa Eligiendo Mi Camino — Coordinador AIP/PIP</w:t>
+              <w:t>Programa Eligiendo Mi Camino — Coordinador AIP/PIP   ·   Protocolo 1 de 5: Conectividad</w:t>
             </w:r>
           </w:p>
         </w:tc>
@@ -101,6 +101,7 @@
               <w:rPr>
                 <w:sz w:val="20"/>
               </w:rPr>
+              <w:t>1</w:t>
             </w:r>
           </w:p>
         </w:tc>
@@ -141,7 +142,7 @@
               <w:rPr>
                 <w:sz w:val="20"/>
               </w:rPr>
-              <w:t>☐ Conectividad   ☐ Accesos/Contraseñas   ☐ Equipos   ☐ Evaluaciones   ☐ Escalamiento</w:t>
+              <w:t>☑ Conectividad   ☐ Accesos/Contraseñas   ☐ Equipos   ☐ Evaluaciones   ☐ Escalamiento</w:t>
             </w:r>
           </w:p>
         </w:tc>
@@ -339,13 +340,10 @@
                 <w:color w:val="888888"/>
                 <w:sz w:val="19"/>
               </w:rPr>
-              <w:t>Describí brevemente la situación o el problema técnico que cubre este protocolo. ¿Qué pasa? ¿Cuándo aparece? ¿A qué afecta (clase, evaluación, acceso)?</w:t>
+              <w:t>Ejemplo de esta categoría: Caída de internet, ancho de banda insuficiente, intermitencia en el WiFi del laboratorio que impide a los estudiantes acceder a uDocz.</w:t>
+              <w:br/>
+              <w:t>Describí brevemente la situación o el problema técnico que cubre este protocolo. ¿Qué pasa? ¿Cuándo aparece? ¿A qué afecta?</w:t>
             </w:r>
-          </w:p>
-          <w:p>
-            <w:pPr>
-              <w:spacing w:after="40"/>
-            </w:pPr>
           </w:p>
           <w:p>
             <w:pPr>
@@ -448,11 +446,6 @@
               <w:spacing w:after="40"/>
             </w:pPr>
           </w:p>
-          <w:p>
-            <w:pPr>
-              <w:spacing w:after="40"/>
-            </w:pPr>
-          </w:p>
         </w:tc>
       </w:tr>
     </w:tbl>
@@ -520,13 +513,8 @@
                 <w:color w:val="888888"/>
                 <w:sz w:val="19"/>
               </w:rPr>
-              <w:t>¿Cómo sabés que el problema quedó resuelto? (ej.: "el estudiante puede ingresar a uDocz desde su tablet", "la sesión registra presencia del docente").</w:t>
+              <w:t>¿Cómo sabés que el problema quedó resuelto?</w:t>
             </w:r>
-          </w:p>
-          <w:p>
-            <w:pPr>
-              <w:spacing w:after="40"/>
-            </w:pPr>
           </w:p>
           <w:p>
             <w:pPr>
@@ -605,13 +593,8 @@
                 <w:color w:val="888888"/>
                 <w:sz w:val="19"/>
               </w:rPr>
-              <w:t>¿En qué condiciones este protocolo no alcanza y hay que escalar a eligiendomicamino@worldbank.org? (ej.: "si después de los pasos 1-3 el problema persiste", "si afecta a más de 3 estudiantes a la vez").</w:t>
+              <w:t>¿En qué condiciones este protocolo no alcanza y hay que escalar a eligiendomicamino@worldbank.org?</w:t>
             </w:r>
-          </w:p>
-          <w:p>
-            <w:pPr>
-              <w:spacing w:after="40"/>
-            </w:pPr>
           </w:p>
           <w:p>
             <w:pPr>
@@ -641,7 +624,2527 @@
           <w:color w:val="666666"/>
           <w:sz w:val="18"/>
         </w:rPr>
-        <w:t>📩 Enviar este protocolo (y los otros 4) a: eligiendomicamino@worldbank.org   |   Mínimo 4 de 5 para aprobar el componente</w:t>
+        <w:t>📩 Enviar los 5 protocolos a: eligiendomicamino@worldbank.org   |   Mínimo 4 de 5 para aprobar este componente   |   Página 1 de 5</w:t>
+      </w:r>
+    </w:p>
+    <w:p>
+      <w:r>
+        <w:br w:type="page"/>
+      </w:r>
+    </w:p>
+    <w:tbl>
+      <w:tblPr>
+        <w:tblW w:type="auto" w:w="0"/>
+        <w:jc w:val="center"/>
+        <w:tblLook w:firstColumn="1" w:firstRow="1" w:lastColumn="0" w:lastRow="0" w:noHBand="0" w:noVBand="1" w:val="04A0"/>
+      </w:tblPr>
+      <w:tblGrid>
+        <w:gridCol w:w="10200"/>
+      </w:tblGrid>
+      <w:tr>
+        <w:tc>
+          <w:tcPr>
+            <w:tcW w:type="dxa" w:w="10200"/>
+            <w:shd w:val="clear" w:color="auto" w:fill="F39300"/>
+          </w:tcPr>
+          <w:p>
+            <w:pPr>
+              <w:jc w:val="center"/>
+            </w:pPr>
+            <w:r>
+              <w:rPr>
+                <w:b/>
+                <w:color w:val="FFFFFF"/>
+                <w:sz w:val="26"/>
+              </w:rPr>
+              <w:t>FORMATO DE REGISTRO DE INCIDENCIAS TÉCNICAS</w:t>
+            </w:r>
+          </w:p>
+          <w:p>
+            <w:pPr>
+              <w:jc w:val="center"/>
+            </w:pPr>
+            <w:r>
+              <w:rPr>
+                <w:i/>
+                <w:color w:val="FFFFFF"/>
+                <w:sz w:val="20"/>
+              </w:rPr>
+              <w:t>Programa Eligiendo Mi Camino — Coordinador AIP/PIP   ·   Protocolo 2 de 5: Accesos / Contraseñas</w:t>
+            </w:r>
+          </w:p>
+        </w:tc>
+      </w:tr>
+    </w:tbl>
+    <w:p>
+      <w:pPr>
+        <w:spacing w:after="80"/>
+      </w:pPr>
+    </w:p>
+    <w:tbl>
+      <w:tblPr>
+        <w:tblW w:type="auto" w:w="0"/>
+        <w:tblLayout w:type="fixed"/>
+        <w:tblLook w:firstColumn="1" w:firstRow="1" w:lastColumn="0" w:lastRow="0" w:noHBand="0" w:noVBand="1" w:val="04A0"/>
+      </w:tblPr>
+      <w:tblGrid>
+        <w:gridCol w:w="1474"/>
+        <w:gridCol w:w="3628"/>
+        <w:gridCol w:w="1474"/>
+        <w:gridCol w:w="3061"/>
+      </w:tblGrid>
+      <w:tr>
+        <w:tc>
+          <w:tcPr>
+            <w:tcW w:type="dxa" w:w="2550"/>
+            <w:shd w:val="clear" w:color="auto" w:fill="FFFAEB"/>
+            <w:tcBorders>
+              <w:top w:val="single" w:sz="4" w:color="CCCCCC"/>
+              <w:left w:val="single" w:sz="4" w:color="CCCCCC"/>
+              <w:bottom w:val="single" w:sz="4" w:color="CCCCCC"/>
+              <w:right w:val="single" w:sz="4" w:color="CCCCCC"/>
+            </w:tcBorders>
+          </w:tcPr>
+          <w:p>
+            <w:r>
+              <w:rPr>
+                <w:b/>
+                <w:color w:val="F75A00"/>
+                <w:sz w:val="19"/>
+              </w:rPr>
+              <w:t>Protocolo #</w:t>
+            </w:r>
+          </w:p>
+        </w:tc>
+        <w:tc>
+          <w:tcPr>
+            <w:tcW w:type="dxa" w:w="2550"/>
+            <w:tcBorders>
+              <w:top w:val="single" w:sz="4" w:color="CCCCCC"/>
+              <w:left w:val="single" w:sz="4" w:color="CCCCCC"/>
+              <w:bottom w:val="single" w:sz="4" w:color="CCCCCC"/>
+              <w:right w:val="single" w:sz="4" w:color="CCCCCC"/>
+            </w:tcBorders>
+          </w:tcPr>
+          <w:p>
+            <w:r>
+              <w:rPr>
+                <w:sz w:val="20"/>
+              </w:rPr>
+              <w:t>2</w:t>
+            </w:r>
+          </w:p>
+        </w:tc>
+        <w:tc>
+          <w:tcPr>
+            <w:tcW w:type="dxa" w:w="2550"/>
+            <w:shd w:val="clear" w:color="auto" w:fill="FFFAEB"/>
+            <w:tcBorders>
+              <w:top w:val="single" w:sz="4" w:color="CCCCCC"/>
+              <w:left w:val="single" w:sz="4" w:color="CCCCCC"/>
+              <w:bottom w:val="single" w:sz="4" w:color="CCCCCC"/>
+              <w:right w:val="single" w:sz="4" w:color="CCCCCC"/>
+            </w:tcBorders>
+          </w:tcPr>
+          <w:p>
+            <w:r>
+              <w:rPr>
+                <w:b/>
+                <w:color w:val="F75A00"/>
+                <w:sz w:val="19"/>
+              </w:rPr>
+              <w:t>Categoría</w:t>
+            </w:r>
+          </w:p>
+        </w:tc>
+        <w:tc>
+          <w:tcPr>
+            <w:tcW w:type="dxa" w:w="2550"/>
+            <w:tcBorders>
+              <w:top w:val="single" w:sz="4" w:color="CCCCCC"/>
+              <w:left w:val="single" w:sz="4" w:color="CCCCCC"/>
+              <w:bottom w:val="single" w:sz="4" w:color="CCCCCC"/>
+              <w:right w:val="single" w:sz="4" w:color="CCCCCC"/>
+            </w:tcBorders>
+          </w:tcPr>
+          <w:p>
+            <w:r>
+              <w:rPr>
+                <w:sz w:val="20"/>
+              </w:rPr>
+              <w:t>☐ Conectividad   ☑ Accesos/Contraseñas   ☐ Equipos   ☐ Evaluaciones   ☐ Escalamiento</w:t>
+            </w:r>
+          </w:p>
+        </w:tc>
+      </w:tr>
+      <w:tr>
+        <w:tc>
+          <w:tcPr>
+            <w:tcW w:type="dxa" w:w="2550"/>
+            <w:shd w:val="clear" w:color="auto" w:fill="FFFAEB"/>
+            <w:tcBorders>
+              <w:top w:val="single" w:sz="4" w:color="CCCCCC"/>
+              <w:left w:val="single" w:sz="4" w:color="CCCCCC"/>
+              <w:bottom w:val="single" w:sz="4" w:color="CCCCCC"/>
+              <w:right w:val="single" w:sz="4" w:color="CCCCCC"/>
+            </w:tcBorders>
+          </w:tcPr>
+          <w:p>
+            <w:r>
+              <w:rPr>
+                <w:b/>
+                <w:color w:val="F75A00"/>
+                <w:sz w:val="19"/>
+              </w:rPr>
+              <w:t>IE</w:t>
+            </w:r>
+          </w:p>
+        </w:tc>
+        <w:tc>
+          <w:tcPr>
+            <w:tcW w:type="dxa" w:w="2550"/>
+            <w:tcBorders>
+              <w:top w:val="single" w:sz="4" w:color="CCCCCC"/>
+              <w:left w:val="single" w:sz="4" w:color="CCCCCC"/>
+              <w:bottom w:val="single" w:sz="4" w:color="CCCCCC"/>
+              <w:right w:val="single" w:sz="4" w:color="CCCCCC"/>
+            </w:tcBorders>
+          </w:tcPr>
+          <w:p>
+            <w:r>
+              <w:rPr>
+                <w:sz w:val="20"/>
+              </w:rPr>
+            </w:r>
+          </w:p>
+        </w:tc>
+        <w:tc>
+          <w:tcPr>
+            <w:tcW w:type="dxa" w:w="2550"/>
+            <w:shd w:val="clear" w:color="auto" w:fill="FFFAEB"/>
+            <w:tcBorders>
+              <w:top w:val="single" w:sz="4" w:color="CCCCCC"/>
+              <w:left w:val="single" w:sz="4" w:color="CCCCCC"/>
+              <w:bottom w:val="single" w:sz="4" w:color="CCCCCC"/>
+              <w:right w:val="single" w:sz="4" w:color="CCCCCC"/>
+            </w:tcBorders>
+          </w:tcPr>
+          <w:p>
+            <w:r>
+              <w:rPr>
+                <w:b/>
+                <w:color w:val="F75A00"/>
+                <w:sz w:val="19"/>
+              </w:rPr>
+              <w:t>Coordinador AIP/PIP</w:t>
+            </w:r>
+          </w:p>
+        </w:tc>
+        <w:tc>
+          <w:tcPr>
+            <w:tcW w:type="dxa" w:w="2550"/>
+            <w:tcBorders>
+              <w:top w:val="single" w:sz="4" w:color="CCCCCC"/>
+              <w:left w:val="single" w:sz="4" w:color="CCCCCC"/>
+              <w:bottom w:val="single" w:sz="4" w:color="CCCCCC"/>
+              <w:right w:val="single" w:sz="4" w:color="CCCCCC"/>
+            </w:tcBorders>
+          </w:tcPr>
+          <w:p>
+            <w:r>
+              <w:rPr>
+                <w:sz w:val="20"/>
+              </w:rPr>
+            </w:r>
+          </w:p>
+        </w:tc>
+      </w:tr>
+    </w:tbl>
+    <w:tbl>
+      <w:tblPr>
+        <w:tblW w:type="auto" w:w="0"/>
+        <w:tblLook w:firstColumn="1" w:firstRow="1" w:lastColumn="0" w:lastRow="0" w:noHBand="0" w:noVBand="1" w:val="04A0"/>
+      </w:tblPr>
+      <w:tblGrid>
+        <w:gridCol w:w="1474"/>
+        <w:gridCol w:w="8164"/>
+      </w:tblGrid>
+      <w:tr>
+        <w:tc>
+          <w:tcPr>
+            <w:tcW w:type="dxa" w:w="5100"/>
+            <w:shd w:val="clear" w:color="auto" w:fill="FFFAEB"/>
+            <w:tcBorders>
+              <w:top w:val="single" w:sz="4" w:color="CCCCCC"/>
+              <w:left w:val="single" w:sz="4" w:color="CCCCCC"/>
+              <w:bottom w:val="single" w:sz="4" w:color="CCCCCC"/>
+              <w:right w:val="single" w:sz="4" w:color="CCCCCC"/>
+            </w:tcBorders>
+          </w:tcPr>
+          <w:p>
+            <w:r>
+              <w:rPr>
+                <w:b/>
+                <w:color w:val="F75A00"/>
+                <w:sz w:val="19"/>
+              </w:rPr>
+              <w:t>Fecha</w:t>
+            </w:r>
+          </w:p>
+        </w:tc>
+        <w:tc>
+          <w:tcPr>
+            <w:tcW w:type="dxa" w:w="5100"/>
+            <w:tcBorders>
+              <w:top w:val="single" w:sz="4" w:color="CCCCCC"/>
+              <w:left w:val="single" w:sz="4" w:color="CCCCCC"/>
+              <w:bottom w:val="single" w:sz="4" w:color="CCCCCC"/>
+              <w:right w:val="single" w:sz="4" w:color="CCCCCC"/>
+            </w:tcBorders>
+          </w:tcPr>
+          <w:p/>
+        </w:tc>
+      </w:tr>
+    </w:tbl>
+    <w:p>
+      <w:pPr>
+        <w:spacing w:after="40"/>
+      </w:pPr>
+    </w:p>
+    <w:tbl>
+      <w:tblPr>
+        <w:tblW w:type="auto" w:w="0"/>
+        <w:tblLook w:firstColumn="1" w:firstRow="1" w:lastColumn="0" w:lastRow="0" w:noHBand="0" w:noVBand="1" w:val="04A0"/>
+      </w:tblPr>
+      <w:tblGrid>
+        <w:gridCol w:w="10200"/>
+      </w:tblGrid>
+      <w:tr>
+        <w:tc>
+          <w:tcPr>
+            <w:tcW w:type="dxa" w:w="10200"/>
+            <w:shd w:val="clear" w:color="auto" w:fill="F39300"/>
+            <w:tcBorders>
+              <w:top w:val="single" w:sz="4" w:color="F39300"/>
+              <w:left w:val="single" w:sz="4" w:color="F39300"/>
+              <w:bottom w:val="single" w:sz="4" w:color="F39300"/>
+              <w:right w:val="single" w:sz="4" w:color="F39300"/>
+            </w:tcBorders>
+          </w:tcPr>
+          <w:p>
+            <w:r>
+              <w:rPr>
+                <w:b/>
+                <w:color w:val="FFFFFF"/>
+                <w:sz w:val="22"/>
+              </w:rPr>
+              <w:t>1. Situación / problema típico</w:t>
+            </w:r>
+          </w:p>
+        </w:tc>
+      </w:tr>
+    </w:tbl>
+    <w:tbl>
+      <w:tblPr>
+        <w:tblW w:type="auto" w:w="0"/>
+        <w:tblLook w:firstColumn="1" w:firstRow="1" w:lastColumn="0" w:lastRow="0" w:noHBand="0" w:noVBand="1" w:val="04A0"/>
+      </w:tblPr>
+      <w:tblGrid>
+        <w:gridCol w:w="10200"/>
+      </w:tblGrid>
+      <w:tr>
+        <w:tc>
+          <w:tcPr>
+            <w:tcW w:type="dxa" w:w="10200"/>
+            <w:tcBorders>
+              <w:top w:val="single" w:sz="4" w:color="F39300"/>
+              <w:left w:val="single" w:sz="4" w:color="F39300"/>
+              <w:bottom w:val="single" w:sz="4" w:color="F39300"/>
+              <w:right w:val="single" w:sz="4" w:color="F39300"/>
+            </w:tcBorders>
+          </w:tcPr>
+          <w:p>
+            <w:r>
+              <w:rPr>
+                <w:i/>
+                <w:color w:val="888888"/>
+                <w:sz w:val="19"/>
+              </w:rPr>
+              <w:t>Ejemplo de esta categoría: Estudiante o docente no puede iniciar sesión en uDocz: olvido de contraseña, usuario bloqueado, cuenta no creada, problemas con el correo institucional.</w:t>
+              <w:br/>
+              <w:t>Describí brevemente la situación o el problema técnico que cubre este protocolo. ¿Qué pasa? ¿Cuándo aparece? ¿A qué afecta?</w:t>
+            </w:r>
+          </w:p>
+          <w:p>
+            <w:pPr>
+              <w:spacing w:after="40"/>
+            </w:pPr>
+          </w:p>
+          <w:p>
+            <w:pPr>
+              <w:spacing w:after="40"/>
+            </w:pPr>
+          </w:p>
+        </w:tc>
+      </w:tr>
+    </w:tbl>
+    <w:p>
+      <w:pPr>
+        <w:spacing w:after="40"/>
+      </w:pPr>
+    </w:p>
+    <w:tbl>
+      <w:tblPr>
+        <w:tblW w:type="auto" w:w="0"/>
+        <w:tblLook w:firstColumn="1" w:firstRow="1" w:lastColumn="0" w:lastRow="0" w:noHBand="0" w:noVBand="1" w:val="04A0"/>
+      </w:tblPr>
+      <w:tblGrid>
+        <w:gridCol w:w="10200"/>
+      </w:tblGrid>
+      <w:tr>
+        <w:tc>
+          <w:tcPr>
+            <w:tcW w:type="dxa" w:w="10200"/>
+            <w:shd w:val="clear" w:color="auto" w:fill="F39300"/>
+            <w:tcBorders>
+              <w:top w:val="single" w:sz="4" w:color="F39300"/>
+              <w:left w:val="single" w:sz="4" w:color="F39300"/>
+              <w:bottom w:val="single" w:sz="4" w:color="F39300"/>
+              <w:right w:val="single" w:sz="4" w:color="F39300"/>
+            </w:tcBorders>
+          </w:tcPr>
+          <w:p>
+            <w:r>
+              <w:rPr>
+                <w:b/>
+                <w:color w:val="FFFFFF"/>
+                <w:sz w:val="22"/>
+              </w:rPr>
+              <w:t>2. Pasos para resolverlo</w:t>
+            </w:r>
+          </w:p>
+        </w:tc>
+      </w:tr>
+    </w:tbl>
+    <w:tbl>
+      <w:tblPr>
+        <w:tblW w:type="auto" w:w="0"/>
+        <w:tblLook w:firstColumn="1" w:firstRow="1" w:lastColumn="0" w:lastRow="0" w:noHBand="0" w:noVBand="1" w:val="04A0"/>
+      </w:tblPr>
+      <w:tblGrid>
+        <w:gridCol w:w="10200"/>
+      </w:tblGrid>
+      <w:tr>
+        <w:tc>
+          <w:tcPr>
+            <w:tcW w:type="dxa" w:w="10200"/>
+            <w:tcBorders>
+              <w:top w:val="single" w:sz="4" w:color="F39300"/>
+              <w:left w:val="single" w:sz="4" w:color="F39300"/>
+              <w:bottom w:val="single" w:sz="4" w:color="F39300"/>
+              <w:right w:val="single" w:sz="4" w:color="F39300"/>
+            </w:tcBorders>
+          </w:tcPr>
+          <w:p>
+            <w:r>
+              <w:rPr>
+                <w:i/>
+                <w:color w:val="888888"/>
+                <w:sz w:val="19"/>
+              </w:rPr>
+              <w:t>Enumerá los pasos concretos, en orden. Sé específico: qué clic, qué cable, qué comprobar.</w:t>
+              <w:br/>
+              <w:br/>
+              <w:t xml:space="preserve">1. </w:t>
+              <w:br/>
+              <w:t xml:space="preserve">2. </w:t>
+              <w:br/>
+              <w:t xml:space="preserve">3. </w:t>
+              <w:br/>
+              <w:t xml:space="preserve">4. </w:t>
+              <w:br/>
+              <w:t xml:space="preserve">5. </w:t>
+            </w:r>
+          </w:p>
+          <w:p>
+            <w:pPr>
+              <w:spacing w:after="40"/>
+            </w:pPr>
+          </w:p>
+          <w:p>
+            <w:pPr>
+              <w:spacing w:after="40"/>
+            </w:pPr>
+          </w:p>
+        </w:tc>
+      </w:tr>
+    </w:tbl>
+    <w:p>
+      <w:pPr>
+        <w:spacing w:after="40"/>
+      </w:pPr>
+    </w:p>
+    <w:tbl>
+      <w:tblPr>
+        <w:tblW w:type="auto" w:w="0"/>
+        <w:tblLook w:firstColumn="1" w:firstRow="1" w:lastColumn="0" w:lastRow="0" w:noHBand="0" w:noVBand="1" w:val="04A0"/>
+      </w:tblPr>
+      <w:tblGrid>
+        <w:gridCol w:w="10200"/>
+      </w:tblGrid>
+      <w:tr>
+        <w:tc>
+          <w:tcPr>
+            <w:tcW w:type="dxa" w:w="10200"/>
+            <w:shd w:val="clear" w:color="auto" w:fill="F39300"/>
+            <w:tcBorders>
+              <w:top w:val="single" w:sz="4" w:color="F39300"/>
+              <w:left w:val="single" w:sz="4" w:color="F39300"/>
+              <w:bottom w:val="single" w:sz="4" w:color="F39300"/>
+              <w:right w:val="single" w:sz="4" w:color="F39300"/>
+            </w:tcBorders>
+          </w:tcPr>
+          <w:p>
+            <w:r>
+              <w:rPr>
+                <w:b/>
+                <w:color w:val="FFFFFF"/>
+                <w:sz w:val="22"/>
+              </w:rPr>
+              <w:t>3. Criterio de cierre</w:t>
+            </w:r>
+          </w:p>
+        </w:tc>
+      </w:tr>
+    </w:tbl>
+    <w:tbl>
+      <w:tblPr>
+        <w:tblW w:type="auto" w:w="0"/>
+        <w:tblLook w:firstColumn="1" w:firstRow="1" w:lastColumn="0" w:lastRow="0" w:noHBand="0" w:noVBand="1" w:val="04A0"/>
+      </w:tblPr>
+      <w:tblGrid>
+        <w:gridCol w:w="10200"/>
+      </w:tblGrid>
+      <w:tr>
+        <w:tc>
+          <w:tcPr>
+            <w:tcW w:type="dxa" w:w="10200"/>
+            <w:tcBorders>
+              <w:top w:val="single" w:sz="4" w:color="F39300"/>
+              <w:left w:val="single" w:sz="4" w:color="F39300"/>
+              <w:bottom w:val="single" w:sz="4" w:color="F39300"/>
+              <w:right w:val="single" w:sz="4" w:color="F39300"/>
+            </w:tcBorders>
+          </w:tcPr>
+          <w:p>
+            <w:r>
+              <w:rPr>
+                <w:i/>
+                <w:color w:val="888888"/>
+                <w:sz w:val="19"/>
+              </w:rPr>
+              <w:t>¿Cómo sabés que el problema quedó resuelto?</w:t>
+            </w:r>
+          </w:p>
+          <w:p>
+            <w:pPr>
+              <w:spacing w:after="40"/>
+            </w:pPr>
+          </w:p>
+          <w:p>
+            <w:pPr>
+              <w:spacing w:after="40"/>
+            </w:pPr>
+          </w:p>
+        </w:tc>
+      </w:tr>
+    </w:tbl>
+    <w:p>
+      <w:pPr>
+        <w:spacing w:after="40"/>
+      </w:pPr>
+    </w:p>
+    <w:tbl>
+      <w:tblPr>
+        <w:tblW w:type="auto" w:w="0"/>
+        <w:tblLook w:firstColumn="1" w:firstRow="1" w:lastColumn="0" w:lastRow="0" w:noHBand="0" w:noVBand="1" w:val="04A0"/>
+      </w:tblPr>
+      <w:tblGrid>
+        <w:gridCol w:w="10200"/>
+      </w:tblGrid>
+      <w:tr>
+        <w:tc>
+          <w:tcPr>
+            <w:tcW w:type="dxa" w:w="10200"/>
+            <w:shd w:val="clear" w:color="auto" w:fill="F39300"/>
+            <w:tcBorders>
+              <w:top w:val="single" w:sz="4" w:color="F39300"/>
+              <w:left w:val="single" w:sz="4" w:color="F39300"/>
+              <w:bottom w:val="single" w:sz="4" w:color="F39300"/>
+              <w:right w:val="single" w:sz="4" w:color="F39300"/>
+            </w:tcBorders>
+          </w:tcPr>
+          <w:p>
+            <w:r>
+              <w:rPr>
+                <w:b/>
+                <w:color w:val="FFFFFF"/>
+                <w:sz w:val="22"/>
+              </w:rPr>
+              <w:t>4. Cuándo escalar al equipo EMC</w:t>
+            </w:r>
+          </w:p>
+        </w:tc>
+      </w:tr>
+    </w:tbl>
+    <w:tbl>
+      <w:tblPr>
+        <w:tblW w:type="auto" w:w="0"/>
+        <w:tblLook w:firstColumn="1" w:firstRow="1" w:lastColumn="0" w:lastRow="0" w:noHBand="0" w:noVBand="1" w:val="04A0"/>
+      </w:tblPr>
+      <w:tblGrid>
+        <w:gridCol w:w="10200"/>
+      </w:tblGrid>
+      <w:tr>
+        <w:tc>
+          <w:tcPr>
+            <w:tcW w:type="dxa" w:w="10200"/>
+            <w:tcBorders>
+              <w:top w:val="single" w:sz="4" w:color="F39300"/>
+              <w:left w:val="single" w:sz="4" w:color="F39300"/>
+              <w:bottom w:val="single" w:sz="4" w:color="F39300"/>
+              <w:right w:val="single" w:sz="4" w:color="F39300"/>
+            </w:tcBorders>
+          </w:tcPr>
+          <w:p>
+            <w:r>
+              <w:rPr>
+                <w:i/>
+                <w:color w:val="888888"/>
+                <w:sz w:val="19"/>
+              </w:rPr>
+              <w:t>¿En qué condiciones este protocolo no alcanza y hay que escalar a eligiendomicamino@worldbank.org?</w:t>
+            </w:r>
+          </w:p>
+          <w:p>
+            <w:pPr>
+              <w:spacing w:after="40"/>
+            </w:pPr>
+          </w:p>
+          <w:p>
+            <w:pPr>
+              <w:spacing w:after="40"/>
+            </w:pPr>
+          </w:p>
+        </w:tc>
+      </w:tr>
+    </w:tbl>
+    <w:p>
+      <w:pPr>
+        <w:spacing w:after="40"/>
+      </w:pPr>
+    </w:p>
+    <w:p>
+      <w:pPr>
+        <w:jc w:val="center"/>
+      </w:pPr>
+      <w:r>
+        <w:rPr>
+          <w:i/>
+          <w:color w:val="666666"/>
+          <w:sz w:val="18"/>
+        </w:rPr>
+        <w:t>📩 Enviar los 5 protocolos a: eligiendomicamino@worldbank.org   |   Mínimo 4 de 5 para aprobar este componente   |   Página 2 de 5</w:t>
+      </w:r>
+    </w:p>
+    <w:p>
+      <w:r>
+        <w:br w:type="page"/>
+      </w:r>
+    </w:p>
+    <w:tbl>
+      <w:tblPr>
+        <w:tblW w:type="auto" w:w="0"/>
+        <w:jc w:val="center"/>
+        <w:tblLook w:firstColumn="1" w:firstRow="1" w:lastColumn="0" w:lastRow="0" w:noHBand="0" w:noVBand="1" w:val="04A0"/>
+      </w:tblPr>
+      <w:tblGrid>
+        <w:gridCol w:w="10200"/>
+      </w:tblGrid>
+      <w:tr>
+        <w:tc>
+          <w:tcPr>
+            <w:tcW w:type="dxa" w:w="10200"/>
+            <w:shd w:val="clear" w:color="auto" w:fill="F39300"/>
+          </w:tcPr>
+          <w:p>
+            <w:pPr>
+              <w:jc w:val="center"/>
+            </w:pPr>
+            <w:r>
+              <w:rPr>
+                <w:b/>
+                <w:color w:val="FFFFFF"/>
+                <w:sz w:val="26"/>
+              </w:rPr>
+              <w:t>FORMATO DE REGISTRO DE INCIDENCIAS TÉCNICAS</w:t>
+            </w:r>
+          </w:p>
+          <w:p>
+            <w:pPr>
+              <w:jc w:val="center"/>
+            </w:pPr>
+            <w:r>
+              <w:rPr>
+                <w:i/>
+                <w:color w:val="FFFFFF"/>
+                <w:sz w:val="20"/>
+              </w:rPr>
+              <w:t>Programa Eligiendo Mi Camino — Coordinador AIP/PIP   ·   Protocolo 3 de 5: Equipos</w:t>
+            </w:r>
+          </w:p>
+        </w:tc>
+      </w:tr>
+    </w:tbl>
+    <w:p>
+      <w:pPr>
+        <w:spacing w:after="80"/>
+      </w:pPr>
+    </w:p>
+    <w:tbl>
+      <w:tblPr>
+        <w:tblW w:type="auto" w:w="0"/>
+        <w:tblLayout w:type="fixed"/>
+        <w:tblLook w:firstColumn="1" w:firstRow="1" w:lastColumn="0" w:lastRow="0" w:noHBand="0" w:noVBand="1" w:val="04A0"/>
+      </w:tblPr>
+      <w:tblGrid>
+        <w:gridCol w:w="1474"/>
+        <w:gridCol w:w="3628"/>
+        <w:gridCol w:w="1474"/>
+        <w:gridCol w:w="3061"/>
+      </w:tblGrid>
+      <w:tr>
+        <w:tc>
+          <w:tcPr>
+            <w:tcW w:type="dxa" w:w="2550"/>
+            <w:shd w:val="clear" w:color="auto" w:fill="FFFAEB"/>
+            <w:tcBorders>
+              <w:top w:val="single" w:sz="4" w:color="CCCCCC"/>
+              <w:left w:val="single" w:sz="4" w:color="CCCCCC"/>
+              <w:bottom w:val="single" w:sz="4" w:color="CCCCCC"/>
+              <w:right w:val="single" w:sz="4" w:color="CCCCCC"/>
+            </w:tcBorders>
+          </w:tcPr>
+          <w:p>
+            <w:r>
+              <w:rPr>
+                <w:b/>
+                <w:color w:val="F75A00"/>
+                <w:sz w:val="19"/>
+              </w:rPr>
+              <w:t>Protocolo #</w:t>
+            </w:r>
+          </w:p>
+        </w:tc>
+        <w:tc>
+          <w:tcPr>
+            <w:tcW w:type="dxa" w:w="2550"/>
+            <w:tcBorders>
+              <w:top w:val="single" w:sz="4" w:color="CCCCCC"/>
+              <w:left w:val="single" w:sz="4" w:color="CCCCCC"/>
+              <w:bottom w:val="single" w:sz="4" w:color="CCCCCC"/>
+              <w:right w:val="single" w:sz="4" w:color="CCCCCC"/>
+            </w:tcBorders>
+          </w:tcPr>
+          <w:p>
+            <w:r>
+              <w:rPr>
+                <w:sz w:val="20"/>
+              </w:rPr>
+              <w:t>3</w:t>
+            </w:r>
+          </w:p>
+        </w:tc>
+        <w:tc>
+          <w:tcPr>
+            <w:tcW w:type="dxa" w:w="2550"/>
+            <w:shd w:val="clear" w:color="auto" w:fill="FFFAEB"/>
+            <w:tcBorders>
+              <w:top w:val="single" w:sz="4" w:color="CCCCCC"/>
+              <w:left w:val="single" w:sz="4" w:color="CCCCCC"/>
+              <w:bottom w:val="single" w:sz="4" w:color="CCCCCC"/>
+              <w:right w:val="single" w:sz="4" w:color="CCCCCC"/>
+            </w:tcBorders>
+          </w:tcPr>
+          <w:p>
+            <w:r>
+              <w:rPr>
+                <w:b/>
+                <w:color w:val="F75A00"/>
+                <w:sz w:val="19"/>
+              </w:rPr>
+              <w:t>Categoría</w:t>
+            </w:r>
+          </w:p>
+        </w:tc>
+        <w:tc>
+          <w:tcPr>
+            <w:tcW w:type="dxa" w:w="2550"/>
+            <w:tcBorders>
+              <w:top w:val="single" w:sz="4" w:color="CCCCCC"/>
+              <w:left w:val="single" w:sz="4" w:color="CCCCCC"/>
+              <w:bottom w:val="single" w:sz="4" w:color="CCCCCC"/>
+              <w:right w:val="single" w:sz="4" w:color="CCCCCC"/>
+            </w:tcBorders>
+          </w:tcPr>
+          <w:p>
+            <w:r>
+              <w:rPr>
+                <w:sz w:val="20"/>
+              </w:rPr>
+              <w:t>☐ Conectividad   ☐ Accesos/Contraseñas   ☑ Equipos   ☐ Evaluaciones   ☐ Escalamiento</w:t>
+            </w:r>
+          </w:p>
+        </w:tc>
+      </w:tr>
+      <w:tr>
+        <w:tc>
+          <w:tcPr>
+            <w:tcW w:type="dxa" w:w="2550"/>
+            <w:shd w:val="clear" w:color="auto" w:fill="FFFAEB"/>
+            <w:tcBorders>
+              <w:top w:val="single" w:sz="4" w:color="CCCCCC"/>
+              <w:left w:val="single" w:sz="4" w:color="CCCCCC"/>
+              <w:bottom w:val="single" w:sz="4" w:color="CCCCCC"/>
+              <w:right w:val="single" w:sz="4" w:color="CCCCCC"/>
+            </w:tcBorders>
+          </w:tcPr>
+          <w:p>
+            <w:r>
+              <w:rPr>
+                <w:b/>
+                <w:color w:val="F75A00"/>
+                <w:sz w:val="19"/>
+              </w:rPr>
+              <w:t>IE</w:t>
+            </w:r>
+          </w:p>
+        </w:tc>
+        <w:tc>
+          <w:tcPr>
+            <w:tcW w:type="dxa" w:w="2550"/>
+            <w:tcBorders>
+              <w:top w:val="single" w:sz="4" w:color="CCCCCC"/>
+              <w:left w:val="single" w:sz="4" w:color="CCCCCC"/>
+              <w:bottom w:val="single" w:sz="4" w:color="CCCCCC"/>
+              <w:right w:val="single" w:sz="4" w:color="CCCCCC"/>
+            </w:tcBorders>
+          </w:tcPr>
+          <w:p>
+            <w:r>
+              <w:rPr>
+                <w:sz w:val="20"/>
+              </w:rPr>
+            </w:r>
+          </w:p>
+        </w:tc>
+        <w:tc>
+          <w:tcPr>
+            <w:tcW w:type="dxa" w:w="2550"/>
+            <w:shd w:val="clear" w:color="auto" w:fill="FFFAEB"/>
+            <w:tcBorders>
+              <w:top w:val="single" w:sz="4" w:color="CCCCCC"/>
+              <w:left w:val="single" w:sz="4" w:color="CCCCCC"/>
+              <w:bottom w:val="single" w:sz="4" w:color="CCCCCC"/>
+              <w:right w:val="single" w:sz="4" w:color="CCCCCC"/>
+            </w:tcBorders>
+          </w:tcPr>
+          <w:p>
+            <w:r>
+              <w:rPr>
+                <w:b/>
+                <w:color w:val="F75A00"/>
+                <w:sz w:val="19"/>
+              </w:rPr>
+              <w:t>Coordinador AIP/PIP</w:t>
+            </w:r>
+          </w:p>
+        </w:tc>
+        <w:tc>
+          <w:tcPr>
+            <w:tcW w:type="dxa" w:w="2550"/>
+            <w:tcBorders>
+              <w:top w:val="single" w:sz="4" w:color="CCCCCC"/>
+              <w:left w:val="single" w:sz="4" w:color="CCCCCC"/>
+              <w:bottom w:val="single" w:sz="4" w:color="CCCCCC"/>
+              <w:right w:val="single" w:sz="4" w:color="CCCCCC"/>
+            </w:tcBorders>
+          </w:tcPr>
+          <w:p>
+            <w:r>
+              <w:rPr>
+                <w:sz w:val="20"/>
+              </w:rPr>
+            </w:r>
+          </w:p>
+        </w:tc>
+      </w:tr>
+    </w:tbl>
+    <w:tbl>
+      <w:tblPr>
+        <w:tblW w:type="auto" w:w="0"/>
+        <w:tblLook w:firstColumn="1" w:firstRow="1" w:lastColumn="0" w:lastRow="0" w:noHBand="0" w:noVBand="1" w:val="04A0"/>
+      </w:tblPr>
+      <w:tblGrid>
+        <w:gridCol w:w="1474"/>
+        <w:gridCol w:w="8164"/>
+      </w:tblGrid>
+      <w:tr>
+        <w:tc>
+          <w:tcPr>
+            <w:tcW w:type="dxa" w:w="5100"/>
+            <w:shd w:val="clear" w:color="auto" w:fill="FFFAEB"/>
+            <w:tcBorders>
+              <w:top w:val="single" w:sz="4" w:color="CCCCCC"/>
+              <w:left w:val="single" w:sz="4" w:color="CCCCCC"/>
+              <w:bottom w:val="single" w:sz="4" w:color="CCCCCC"/>
+              <w:right w:val="single" w:sz="4" w:color="CCCCCC"/>
+            </w:tcBorders>
+          </w:tcPr>
+          <w:p>
+            <w:r>
+              <w:rPr>
+                <w:b/>
+                <w:color w:val="F75A00"/>
+                <w:sz w:val="19"/>
+              </w:rPr>
+              <w:t>Fecha</w:t>
+            </w:r>
+          </w:p>
+        </w:tc>
+        <w:tc>
+          <w:tcPr>
+            <w:tcW w:type="dxa" w:w="5100"/>
+            <w:tcBorders>
+              <w:top w:val="single" w:sz="4" w:color="CCCCCC"/>
+              <w:left w:val="single" w:sz="4" w:color="CCCCCC"/>
+              <w:bottom w:val="single" w:sz="4" w:color="CCCCCC"/>
+              <w:right w:val="single" w:sz="4" w:color="CCCCCC"/>
+            </w:tcBorders>
+          </w:tcPr>
+          <w:p/>
+        </w:tc>
+      </w:tr>
+    </w:tbl>
+    <w:p>
+      <w:pPr>
+        <w:spacing w:after="40"/>
+      </w:pPr>
+    </w:p>
+    <w:tbl>
+      <w:tblPr>
+        <w:tblW w:type="auto" w:w="0"/>
+        <w:tblLook w:firstColumn="1" w:firstRow="1" w:lastColumn="0" w:lastRow="0" w:noHBand="0" w:noVBand="1" w:val="04A0"/>
+      </w:tblPr>
+      <w:tblGrid>
+        <w:gridCol w:w="10200"/>
+      </w:tblGrid>
+      <w:tr>
+        <w:tc>
+          <w:tcPr>
+            <w:tcW w:type="dxa" w:w="10200"/>
+            <w:shd w:val="clear" w:color="auto" w:fill="F39300"/>
+            <w:tcBorders>
+              <w:top w:val="single" w:sz="4" w:color="F39300"/>
+              <w:left w:val="single" w:sz="4" w:color="F39300"/>
+              <w:bottom w:val="single" w:sz="4" w:color="F39300"/>
+              <w:right w:val="single" w:sz="4" w:color="F39300"/>
+            </w:tcBorders>
+          </w:tcPr>
+          <w:p>
+            <w:r>
+              <w:rPr>
+                <w:b/>
+                <w:color w:val="FFFFFF"/>
+                <w:sz w:val="22"/>
+              </w:rPr>
+              <w:t>1. Situación / problema típico</w:t>
+            </w:r>
+          </w:p>
+        </w:tc>
+      </w:tr>
+    </w:tbl>
+    <w:tbl>
+      <w:tblPr>
+        <w:tblW w:type="auto" w:w="0"/>
+        <w:tblLook w:firstColumn="1" w:firstRow="1" w:lastColumn="0" w:lastRow="0" w:noHBand="0" w:noVBand="1" w:val="04A0"/>
+      </w:tblPr>
+      <w:tblGrid>
+        <w:gridCol w:w="10200"/>
+      </w:tblGrid>
+      <w:tr>
+        <w:tc>
+          <w:tcPr>
+            <w:tcW w:type="dxa" w:w="10200"/>
+            <w:tcBorders>
+              <w:top w:val="single" w:sz="4" w:color="F39300"/>
+              <w:left w:val="single" w:sz="4" w:color="F39300"/>
+              <w:bottom w:val="single" w:sz="4" w:color="F39300"/>
+              <w:right w:val="single" w:sz="4" w:color="F39300"/>
+            </w:tcBorders>
+          </w:tcPr>
+          <w:p>
+            <w:r>
+              <w:rPr>
+                <w:i/>
+                <w:color w:val="888888"/>
+                <w:sz w:val="19"/>
+              </w:rPr>
+              <w:t>Ejemplo de esta categoría: Laptop/tablet que no enciende, batería que no carga, pantalla rota, audio/cámara que no funciona, software desactualizado, mantenimiento preventivo de equipos del AIP/PIP.</w:t>
+              <w:br/>
+              <w:t>Describí brevemente la situación o el problema técnico que cubre este protocolo. ¿Qué pasa? ¿Cuándo aparece? ¿A qué afecta?</w:t>
+            </w:r>
+          </w:p>
+          <w:p>
+            <w:pPr>
+              <w:spacing w:after="40"/>
+            </w:pPr>
+          </w:p>
+          <w:p>
+            <w:pPr>
+              <w:spacing w:after="40"/>
+            </w:pPr>
+          </w:p>
+        </w:tc>
+      </w:tr>
+    </w:tbl>
+    <w:p>
+      <w:pPr>
+        <w:spacing w:after="40"/>
+      </w:pPr>
+    </w:p>
+    <w:tbl>
+      <w:tblPr>
+        <w:tblW w:type="auto" w:w="0"/>
+        <w:tblLook w:firstColumn="1" w:firstRow="1" w:lastColumn="0" w:lastRow="0" w:noHBand="0" w:noVBand="1" w:val="04A0"/>
+      </w:tblPr>
+      <w:tblGrid>
+        <w:gridCol w:w="10200"/>
+      </w:tblGrid>
+      <w:tr>
+        <w:tc>
+          <w:tcPr>
+            <w:tcW w:type="dxa" w:w="10200"/>
+            <w:shd w:val="clear" w:color="auto" w:fill="F39300"/>
+            <w:tcBorders>
+              <w:top w:val="single" w:sz="4" w:color="F39300"/>
+              <w:left w:val="single" w:sz="4" w:color="F39300"/>
+              <w:bottom w:val="single" w:sz="4" w:color="F39300"/>
+              <w:right w:val="single" w:sz="4" w:color="F39300"/>
+            </w:tcBorders>
+          </w:tcPr>
+          <w:p>
+            <w:r>
+              <w:rPr>
+                <w:b/>
+                <w:color w:val="FFFFFF"/>
+                <w:sz w:val="22"/>
+              </w:rPr>
+              <w:t>2. Pasos para resolverlo</w:t>
+            </w:r>
+          </w:p>
+        </w:tc>
+      </w:tr>
+    </w:tbl>
+    <w:tbl>
+      <w:tblPr>
+        <w:tblW w:type="auto" w:w="0"/>
+        <w:tblLook w:firstColumn="1" w:firstRow="1" w:lastColumn="0" w:lastRow="0" w:noHBand="0" w:noVBand="1" w:val="04A0"/>
+      </w:tblPr>
+      <w:tblGrid>
+        <w:gridCol w:w="10200"/>
+      </w:tblGrid>
+      <w:tr>
+        <w:tc>
+          <w:tcPr>
+            <w:tcW w:type="dxa" w:w="10200"/>
+            <w:tcBorders>
+              <w:top w:val="single" w:sz="4" w:color="F39300"/>
+              <w:left w:val="single" w:sz="4" w:color="F39300"/>
+              <w:bottom w:val="single" w:sz="4" w:color="F39300"/>
+              <w:right w:val="single" w:sz="4" w:color="F39300"/>
+            </w:tcBorders>
+          </w:tcPr>
+          <w:p>
+            <w:r>
+              <w:rPr>
+                <w:i/>
+                <w:color w:val="888888"/>
+                <w:sz w:val="19"/>
+              </w:rPr>
+              <w:t>Enumerá los pasos concretos, en orden. Sé específico: qué clic, qué cable, qué comprobar.</w:t>
+              <w:br/>
+              <w:br/>
+              <w:t xml:space="preserve">1. </w:t>
+              <w:br/>
+              <w:t xml:space="preserve">2. </w:t>
+              <w:br/>
+              <w:t xml:space="preserve">3. </w:t>
+              <w:br/>
+              <w:t xml:space="preserve">4. </w:t>
+              <w:br/>
+              <w:t xml:space="preserve">5. </w:t>
+            </w:r>
+          </w:p>
+          <w:p>
+            <w:pPr>
+              <w:spacing w:after="40"/>
+            </w:pPr>
+          </w:p>
+          <w:p>
+            <w:pPr>
+              <w:spacing w:after="40"/>
+            </w:pPr>
+          </w:p>
+        </w:tc>
+      </w:tr>
+    </w:tbl>
+    <w:p>
+      <w:pPr>
+        <w:spacing w:after="40"/>
+      </w:pPr>
+    </w:p>
+    <w:tbl>
+      <w:tblPr>
+        <w:tblW w:type="auto" w:w="0"/>
+        <w:tblLook w:firstColumn="1" w:firstRow="1" w:lastColumn="0" w:lastRow="0" w:noHBand="0" w:noVBand="1" w:val="04A0"/>
+      </w:tblPr>
+      <w:tblGrid>
+        <w:gridCol w:w="10200"/>
+      </w:tblGrid>
+      <w:tr>
+        <w:tc>
+          <w:tcPr>
+            <w:tcW w:type="dxa" w:w="10200"/>
+            <w:shd w:val="clear" w:color="auto" w:fill="F39300"/>
+            <w:tcBorders>
+              <w:top w:val="single" w:sz="4" w:color="F39300"/>
+              <w:left w:val="single" w:sz="4" w:color="F39300"/>
+              <w:bottom w:val="single" w:sz="4" w:color="F39300"/>
+              <w:right w:val="single" w:sz="4" w:color="F39300"/>
+            </w:tcBorders>
+          </w:tcPr>
+          <w:p>
+            <w:r>
+              <w:rPr>
+                <w:b/>
+                <w:color w:val="FFFFFF"/>
+                <w:sz w:val="22"/>
+              </w:rPr>
+              <w:t>3. Criterio de cierre</w:t>
+            </w:r>
+          </w:p>
+        </w:tc>
+      </w:tr>
+    </w:tbl>
+    <w:tbl>
+      <w:tblPr>
+        <w:tblW w:type="auto" w:w="0"/>
+        <w:tblLook w:firstColumn="1" w:firstRow="1" w:lastColumn="0" w:lastRow="0" w:noHBand="0" w:noVBand="1" w:val="04A0"/>
+      </w:tblPr>
+      <w:tblGrid>
+        <w:gridCol w:w="10200"/>
+      </w:tblGrid>
+      <w:tr>
+        <w:tc>
+          <w:tcPr>
+            <w:tcW w:type="dxa" w:w="10200"/>
+            <w:tcBorders>
+              <w:top w:val="single" w:sz="4" w:color="F39300"/>
+              <w:left w:val="single" w:sz="4" w:color="F39300"/>
+              <w:bottom w:val="single" w:sz="4" w:color="F39300"/>
+              <w:right w:val="single" w:sz="4" w:color="F39300"/>
+            </w:tcBorders>
+          </w:tcPr>
+          <w:p>
+            <w:r>
+              <w:rPr>
+                <w:i/>
+                <w:color w:val="888888"/>
+                <w:sz w:val="19"/>
+              </w:rPr>
+              <w:t>¿Cómo sabés que el problema quedó resuelto?</w:t>
+            </w:r>
+          </w:p>
+          <w:p>
+            <w:pPr>
+              <w:spacing w:after="40"/>
+            </w:pPr>
+          </w:p>
+          <w:p>
+            <w:pPr>
+              <w:spacing w:after="40"/>
+            </w:pPr>
+          </w:p>
+        </w:tc>
+      </w:tr>
+    </w:tbl>
+    <w:p>
+      <w:pPr>
+        <w:spacing w:after="40"/>
+      </w:pPr>
+    </w:p>
+    <w:tbl>
+      <w:tblPr>
+        <w:tblW w:type="auto" w:w="0"/>
+        <w:tblLook w:firstColumn="1" w:firstRow="1" w:lastColumn="0" w:lastRow="0" w:noHBand="0" w:noVBand="1" w:val="04A0"/>
+      </w:tblPr>
+      <w:tblGrid>
+        <w:gridCol w:w="10200"/>
+      </w:tblGrid>
+      <w:tr>
+        <w:tc>
+          <w:tcPr>
+            <w:tcW w:type="dxa" w:w="10200"/>
+            <w:shd w:val="clear" w:color="auto" w:fill="F39300"/>
+            <w:tcBorders>
+              <w:top w:val="single" w:sz="4" w:color="F39300"/>
+              <w:left w:val="single" w:sz="4" w:color="F39300"/>
+              <w:bottom w:val="single" w:sz="4" w:color="F39300"/>
+              <w:right w:val="single" w:sz="4" w:color="F39300"/>
+            </w:tcBorders>
+          </w:tcPr>
+          <w:p>
+            <w:r>
+              <w:rPr>
+                <w:b/>
+                <w:color w:val="FFFFFF"/>
+                <w:sz w:val="22"/>
+              </w:rPr>
+              <w:t>4. Cuándo escalar al equipo EMC</w:t>
+            </w:r>
+          </w:p>
+        </w:tc>
+      </w:tr>
+    </w:tbl>
+    <w:tbl>
+      <w:tblPr>
+        <w:tblW w:type="auto" w:w="0"/>
+        <w:tblLook w:firstColumn="1" w:firstRow="1" w:lastColumn="0" w:lastRow="0" w:noHBand="0" w:noVBand="1" w:val="04A0"/>
+      </w:tblPr>
+      <w:tblGrid>
+        <w:gridCol w:w="10200"/>
+      </w:tblGrid>
+      <w:tr>
+        <w:tc>
+          <w:tcPr>
+            <w:tcW w:type="dxa" w:w="10200"/>
+            <w:tcBorders>
+              <w:top w:val="single" w:sz="4" w:color="F39300"/>
+              <w:left w:val="single" w:sz="4" w:color="F39300"/>
+              <w:bottom w:val="single" w:sz="4" w:color="F39300"/>
+              <w:right w:val="single" w:sz="4" w:color="F39300"/>
+            </w:tcBorders>
+          </w:tcPr>
+          <w:p>
+            <w:r>
+              <w:rPr>
+                <w:i/>
+                <w:color w:val="888888"/>
+                <w:sz w:val="19"/>
+              </w:rPr>
+              <w:t>¿En qué condiciones este protocolo no alcanza y hay que escalar a eligiendomicamino@worldbank.org?</w:t>
+            </w:r>
+          </w:p>
+          <w:p>
+            <w:pPr>
+              <w:spacing w:after="40"/>
+            </w:pPr>
+          </w:p>
+          <w:p>
+            <w:pPr>
+              <w:spacing w:after="40"/>
+            </w:pPr>
+          </w:p>
+        </w:tc>
+      </w:tr>
+    </w:tbl>
+    <w:p>
+      <w:pPr>
+        <w:spacing w:after="40"/>
+      </w:pPr>
+    </w:p>
+    <w:p>
+      <w:pPr>
+        <w:jc w:val="center"/>
+      </w:pPr>
+      <w:r>
+        <w:rPr>
+          <w:i/>
+          <w:color w:val="666666"/>
+          <w:sz w:val="18"/>
+        </w:rPr>
+        <w:t>📩 Enviar los 5 protocolos a: eligiendomicamino@worldbank.org   |   Mínimo 4 de 5 para aprobar este componente   |   Página 3 de 5</w:t>
+      </w:r>
+    </w:p>
+    <w:p>
+      <w:r>
+        <w:br w:type="page"/>
+      </w:r>
+    </w:p>
+    <w:tbl>
+      <w:tblPr>
+        <w:tblW w:type="auto" w:w="0"/>
+        <w:jc w:val="center"/>
+        <w:tblLook w:firstColumn="1" w:firstRow="1" w:lastColumn="0" w:lastRow="0" w:noHBand="0" w:noVBand="1" w:val="04A0"/>
+      </w:tblPr>
+      <w:tblGrid>
+        <w:gridCol w:w="10200"/>
+      </w:tblGrid>
+      <w:tr>
+        <w:tc>
+          <w:tcPr>
+            <w:tcW w:type="dxa" w:w="10200"/>
+            <w:shd w:val="clear" w:color="auto" w:fill="F39300"/>
+          </w:tcPr>
+          <w:p>
+            <w:pPr>
+              <w:jc w:val="center"/>
+            </w:pPr>
+            <w:r>
+              <w:rPr>
+                <w:b/>
+                <w:color w:val="FFFFFF"/>
+                <w:sz w:val="26"/>
+              </w:rPr>
+              <w:t>FORMATO DE REGISTRO DE INCIDENCIAS TÉCNICAS</w:t>
+            </w:r>
+          </w:p>
+          <w:p>
+            <w:pPr>
+              <w:jc w:val="center"/>
+            </w:pPr>
+            <w:r>
+              <w:rPr>
+                <w:i/>
+                <w:color w:val="FFFFFF"/>
+                <w:sz w:val="20"/>
+              </w:rPr>
+              <w:t>Programa Eligiendo Mi Camino — Coordinador AIP/PIP   ·   Protocolo 4 de 5: Evaluaciones</w:t>
+            </w:r>
+          </w:p>
+        </w:tc>
+      </w:tr>
+    </w:tbl>
+    <w:p>
+      <w:pPr>
+        <w:spacing w:after="80"/>
+      </w:pPr>
+    </w:p>
+    <w:tbl>
+      <w:tblPr>
+        <w:tblW w:type="auto" w:w="0"/>
+        <w:tblLayout w:type="fixed"/>
+        <w:tblLook w:firstColumn="1" w:firstRow="1" w:lastColumn="0" w:lastRow="0" w:noHBand="0" w:noVBand="1" w:val="04A0"/>
+      </w:tblPr>
+      <w:tblGrid>
+        <w:gridCol w:w="1474"/>
+        <w:gridCol w:w="3628"/>
+        <w:gridCol w:w="1474"/>
+        <w:gridCol w:w="3061"/>
+      </w:tblGrid>
+      <w:tr>
+        <w:tc>
+          <w:tcPr>
+            <w:tcW w:type="dxa" w:w="2550"/>
+            <w:shd w:val="clear" w:color="auto" w:fill="FFFAEB"/>
+            <w:tcBorders>
+              <w:top w:val="single" w:sz="4" w:color="CCCCCC"/>
+              <w:left w:val="single" w:sz="4" w:color="CCCCCC"/>
+              <w:bottom w:val="single" w:sz="4" w:color="CCCCCC"/>
+              <w:right w:val="single" w:sz="4" w:color="CCCCCC"/>
+            </w:tcBorders>
+          </w:tcPr>
+          <w:p>
+            <w:r>
+              <w:rPr>
+                <w:b/>
+                <w:color w:val="F75A00"/>
+                <w:sz w:val="19"/>
+              </w:rPr>
+              <w:t>Protocolo #</w:t>
+            </w:r>
+          </w:p>
+        </w:tc>
+        <w:tc>
+          <w:tcPr>
+            <w:tcW w:type="dxa" w:w="2550"/>
+            <w:tcBorders>
+              <w:top w:val="single" w:sz="4" w:color="CCCCCC"/>
+              <w:left w:val="single" w:sz="4" w:color="CCCCCC"/>
+              <w:bottom w:val="single" w:sz="4" w:color="CCCCCC"/>
+              <w:right w:val="single" w:sz="4" w:color="CCCCCC"/>
+            </w:tcBorders>
+          </w:tcPr>
+          <w:p>
+            <w:r>
+              <w:rPr>
+                <w:sz w:val="20"/>
+              </w:rPr>
+              <w:t>4</w:t>
+            </w:r>
+          </w:p>
+        </w:tc>
+        <w:tc>
+          <w:tcPr>
+            <w:tcW w:type="dxa" w:w="2550"/>
+            <w:shd w:val="clear" w:color="auto" w:fill="FFFAEB"/>
+            <w:tcBorders>
+              <w:top w:val="single" w:sz="4" w:color="CCCCCC"/>
+              <w:left w:val="single" w:sz="4" w:color="CCCCCC"/>
+              <w:bottom w:val="single" w:sz="4" w:color="CCCCCC"/>
+              <w:right w:val="single" w:sz="4" w:color="CCCCCC"/>
+            </w:tcBorders>
+          </w:tcPr>
+          <w:p>
+            <w:r>
+              <w:rPr>
+                <w:b/>
+                <w:color w:val="F75A00"/>
+                <w:sz w:val="19"/>
+              </w:rPr>
+              <w:t>Categoría</w:t>
+            </w:r>
+          </w:p>
+        </w:tc>
+        <w:tc>
+          <w:tcPr>
+            <w:tcW w:type="dxa" w:w="2550"/>
+            <w:tcBorders>
+              <w:top w:val="single" w:sz="4" w:color="CCCCCC"/>
+              <w:left w:val="single" w:sz="4" w:color="CCCCCC"/>
+              <w:bottom w:val="single" w:sz="4" w:color="CCCCCC"/>
+              <w:right w:val="single" w:sz="4" w:color="CCCCCC"/>
+            </w:tcBorders>
+          </w:tcPr>
+          <w:p>
+            <w:r>
+              <w:rPr>
+                <w:sz w:val="20"/>
+              </w:rPr>
+              <w:t>☐ Conectividad   ☐ Accesos/Contraseñas   ☐ Equipos   ☑ Evaluaciones   ☐ Escalamiento</w:t>
+            </w:r>
+          </w:p>
+        </w:tc>
+      </w:tr>
+      <w:tr>
+        <w:tc>
+          <w:tcPr>
+            <w:tcW w:type="dxa" w:w="2550"/>
+            <w:shd w:val="clear" w:color="auto" w:fill="FFFAEB"/>
+            <w:tcBorders>
+              <w:top w:val="single" w:sz="4" w:color="CCCCCC"/>
+              <w:left w:val="single" w:sz="4" w:color="CCCCCC"/>
+              <w:bottom w:val="single" w:sz="4" w:color="CCCCCC"/>
+              <w:right w:val="single" w:sz="4" w:color="CCCCCC"/>
+            </w:tcBorders>
+          </w:tcPr>
+          <w:p>
+            <w:r>
+              <w:rPr>
+                <w:b/>
+                <w:color w:val="F75A00"/>
+                <w:sz w:val="19"/>
+              </w:rPr>
+              <w:t>IE</w:t>
+            </w:r>
+          </w:p>
+        </w:tc>
+        <w:tc>
+          <w:tcPr>
+            <w:tcW w:type="dxa" w:w="2550"/>
+            <w:tcBorders>
+              <w:top w:val="single" w:sz="4" w:color="CCCCCC"/>
+              <w:left w:val="single" w:sz="4" w:color="CCCCCC"/>
+              <w:bottom w:val="single" w:sz="4" w:color="CCCCCC"/>
+              <w:right w:val="single" w:sz="4" w:color="CCCCCC"/>
+            </w:tcBorders>
+          </w:tcPr>
+          <w:p>
+            <w:r>
+              <w:rPr>
+                <w:sz w:val="20"/>
+              </w:rPr>
+            </w:r>
+          </w:p>
+        </w:tc>
+        <w:tc>
+          <w:tcPr>
+            <w:tcW w:type="dxa" w:w="2550"/>
+            <w:shd w:val="clear" w:color="auto" w:fill="FFFAEB"/>
+            <w:tcBorders>
+              <w:top w:val="single" w:sz="4" w:color="CCCCCC"/>
+              <w:left w:val="single" w:sz="4" w:color="CCCCCC"/>
+              <w:bottom w:val="single" w:sz="4" w:color="CCCCCC"/>
+              <w:right w:val="single" w:sz="4" w:color="CCCCCC"/>
+            </w:tcBorders>
+          </w:tcPr>
+          <w:p>
+            <w:r>
+              <w:rPr>
+                <w:b/>
+                <w:color w:val="F75A00"/>
+                <w:sz w:val="19"/>
+              </w:rPr>
+              <w:t>Coordinador AIP/PIP</w:t>
+            </w:r>
+          </w:p>
+        </w:tc>
+        <w:tc>
+          <w:tcPr>
+            <w:tcW w:type="dxa" w:w="2550"/>
+            <w:tcBorders>
+              <w:top w:val="single" w:sz="4" w:color="CCCCCC"/>
+              <w:left w:val="single" w:sz="4" w:color="CCCCCC"/>
+              <w:bottom w:val="single" w:sz="4" w:color="CCCCCC"/>
+              <w:right w:val="single" w:sz="4" w:color="CCCCCC"/>
+            </w:tcBorders>
+          </w:tcPr>
+          <w:p>
+            <w:r>
+              <w:rPr>
+                <w:sz w:val="20"/>
+              </w:rPr>
+            </w:r>
+          </w:p>
+        </w:tc>
+      </w:tr>
+    </w:tbl>
+    <w:tbl>
+      <w:tblPr>
+        <w:tblW w:type="auto" w:w="0"/>
+        <w:tblLook w:firstColumn="1" w:firstRow="1" w:lastColumn="0" w:lastRow="0" w:noHBand="0" w:noVBand="1" w:val="04A0"/>
+      </w:tblPr>
+      <w:tblGrid>
+        <w:gridCol w:w="1474"/>
+        <w:gridCol w:w="8164"/>
+      </w:tblGrid>
+      <w:tr>
+        <w:tc>
+          <w:tcPr>
+            <w:tcW w:type="dxa" w:w="5100"/>
+            <w:shd w:val="clear" w:color="auto" w:fill="FFFAEB"/>
+            <w:tcBorders>
+              <w:top w:val="single" w:sz="4" w:color="CCCCCC"/>
+              <w:left w:val="single" w:sz="4" w:color="CCCCCC"/>
+              <w:bottom w:val="single" w:sz="4" w:color="CCCCCC"/>
+              <w:right w:val="single" w:sz="4" w:color="CCCCCC"/>
+            </w:tcBorders>
+          </w:tcPr>
+          <w:p>
+            <w:r>
+              <w:rPr>
+                <w:b/>
+                <w:color w:val="F75A00"/>
+                <w:sz w:val="19"/>
+              </w:rPr>
+              <w:t>Fecha</w:t>
+            </w:r>
+          </w:p>
+        </w:tc>
+        <w:tc>
+          <w:tcPr>
+            <w:tcW w:type="dxa" w:w="5100"/>
+            <w:tcBorders>
+              <w:top w:val="single" w:sz="4" w:color="CCCCCC"/>
+              <w:left w:val="single" w:sz="4" w:color="CCCCCC"/>
+              <w:bottom w:val="single" w:sz="4" w:color="CCCCCC"/>
+              <w:right w:val="single" w:sz="4" w:color="CCCCCC"/>
+            </w:tcBorders>
+          </w:tcPr>
+          <w:p/>
+        </w:tc>
+      </w:tr>
+    </w:tbl>
+    <w:p>
+      <w:pPr>
+        <w:spacing w:after="40"/>
+      </w:pPr>
+    </w:p>
+    <w:tbl>
+      <w:tblPr>
+        <w:tblW w:type="auto" w:w="0"/>
+        <w:tblLook w:firstColumn="1" w:firstRow="1" w:lastColumn="0" w:lastRow="0" w:noHBand="0" w:noVBand="1" w:val="04A0"/>
+      </w:tblPr>
+      <w:tblGrid>
+        <w:gridCol w:w="10200"/>
+      </w:tblGrid>
+      <w:tr>
+        <w:tc>
+          <w:tcPr>
+            <w:tcW w:type="dxa" w:w="10200"/>
+            <w:shd w:val="clear" w:color="auto" w:fill="F39300"/>
+            <w:tcBorders>
+              <w:top w:val="single" w:sz="4" w:color="F39300"/>
+              <w:left w:val="single" w:sz="4" w:color="F39300"/>
+              <w:bottom w:val="single" w:sz="4" w:color="F39300"/>
+              <w:right w:val="single" w:sz="4" w:color="F39300"/>
+            </w:tcBorders>
+          </w:tcPr>
+          <w:p>
+            <w:r>
+              <w:rPr>
+                <w:b/>
+                <w:color w:val="FFFFFF"/>
+                <w:sz w:val="22"/>
+              </w:rPr>
+              <w:t>1. Situación / problema típico</w:t>
+            </w:r>
+          </w:p>
+        </w:tc>
+      </w:tr>
+    </w:tbl>
+    <w:tbl>
+      <w:tblPr>
+        <w:tblW w:type="auto" w:w="0"/>
+        <w:tblLook w:firstColumn="1" w:firstRow="1" w:lastColumn="0" w:lastRow="0" w:noHBand="0" w:noVBand="1" w:val="04A0"/>
+      </w:tblPr>
+      <w:tblGrid>
+        <w:gridCol w:w="10200"/>
+      </w:tblGrid>
+      <w:tr>
+        <w:tc>
+          <w:tcPr>
+            <w:tcW w:type="dxa" w:w="10200"/>
+            <w:tcBorders>
+              <w:top w:val="single" w:sz="4" w:color="F39300"/>
+              <w:left w:val="single" w:sz="4" w:color="F39300"/>
+              <w:bottom w:val="single" w:sz="4" w:color="F39300"/>
+              <w:right w:val="single" w:sz="4" w:color="F39300"/>
+            </w:tcBorders>
+          </w:tcPr>
+          <w:p>
+            <w:r>
+              <w:rPr>
+                <w:i/>
+                <w:color w:val="888888"/>
+                <w:sz w:val="19"/>
+              </w:rPr>
+              <w:t>Ejemplo de esta categoría: Problemas técnicos durante una evaluación IPA o sesión clave del programa: equipo que falla en medio de la prueba, estudiante que pierde sesión, dispositivo que se queda sin batería.</w:t>
+              <w:br/>
+              <w:t>Describí brevemente la situación o el problema técnico que cubre este protocolo. ¿Qué pasa? ¿Cuándo aparece? ¿A qué afecta?</w:t>
+            </w:r>
+          </w:p>
+          <w:p>
+            <w:pPr>
+              <w:spacing w:after="40"/>
+            </w:pPr>
+          </w:p>
+          <w:p>
+            <w:pPr>
+              <w:spacing w:after="40"/>
+            </w:pPr>
+          </w:p>
+        </w:tc>
+      </w:tr>
+    </w:tbl>
+    <w:p>
+      <w:pPr>
+        <w:spacing w:after="40"/>
+      </w:pPr>
+    </w:p>
+    <w:tbl>
+      <w:tblPr>
+        <w:tblW w:type="auto" w:w="0"/>
+        <w:tblLook w:firstColumn="1" w:firstRow="1" w:lastColumn="0" w:lastRow="0" w:noHBand="0" w:noVBand="1" w:val="04A0"/>
+      </w:tblPr>
+      <w:tblGrid>
+        <w:gridCol w:w="10200"/>
+      </w:tblGrid>
+      <w:tr>
+        <w:tc>
+          <w:tcPr>
+            <w:tcW w:type="dxa" w:w="10200"/>
+            <w:shd w:val="clear" w:color="auto" w:fill="F39300"/>
+            <w:tcBorders>
+              <w:top w:val="single" w:sz="4" w:color="F39300"/>
+              <w:left w:val="single" w:sz="4" w:color="F39300"/>
+              <w:bottom w:val="single" w:sz="4" w:color="F39300"/>
+              <w:right w:val="single" w:sz="4" w:color="F39300"/>
+            </w:tcBorders>
+          </w:tcPr>
+          <w:p>
+            <w:r>
+              <w:rPr>
+                <w:b/>
+                <w:color w:val="FFFFFF"/>
+                <w:sz w:val="22"/>
+              </w:rPr>
+              <w:t>2. Pasos para resolverlo</w:t>
+            </w:r>
+          </w:p>
+        </w:tc>
+      </w:tr>
+    </w:tbl>
+    <w:tbl>
+      <w:tblPr>
+        <w:tblW w:type="auto" w:w="0"/>
+        <w:tblLook w:firstColumn="1" w:firstRow="1" w:lastColumn="0" w:lastRow="0" w:noHBand="0" w:noVBand="1" w:val="04A0"/>
+      </w:tblPr>
+      <w:tblGrid>
+        <w:gridCol w:w="10200"/>
+      </w:tblGrid>
+      <w:tr>
+        <w:tc>
+          <w:tcPr>
+            <w:tcW w:type="dxa" w:w="10200"/>
+            <w:tcBorders>
+              <w:top w:val="single" w:sz="4" w:color="F39300"/>
+              <w:left w:val="single" w:sz="4" w:color="F39300"/>
+              <w:bottom w:val="single" w:sz="4" w:color="F39300"/>
+              <w:right w:val="single" w:sz="4" w:color="F39300"/>
+            </w:tcBorders>
+          </w:tcPr>
+          <w:p>
+            <w:r>
+              <w:rPr>
+                <w:i/>
+                <w:color w:val="888888"/>
+                <w:sz w:val="19"/>
+              </w:rPr>
+              <w:t>Enumerá los pasos concretos, en orden. Sé específico: qué clic, qué cable, qué comprobar.</w:t>
+              <w:br/>
+              <w:br/>
+              <w:t xml:space="preserve">1. </w:t>
+              <w:br/>
+              <w:t xml:space="preserve">2. </w:t>
+              <w:br/>
+              <w:t xml:space="preserve">3. </w:t>
+              <w:br/>
+              <w:t xml:space="preserve">4. </w:t>
+              <w:br/>
+              <w:t xml:space="preserve">5. </w:t>
+            </w:r>
+          </w:p>
+          <w:p>
+            <w:pPr>
+              <w:spacing w:after="40"/>
+            </w:pPr>
+          </w:p>
+          <w:p>
+            <w:pPr>
+              <w:spacing w:after="40"/>
+            </w:pPr>
+          </w:p>
+        </w:tc>
+      </w:tr>
+    </w:tbl>
+    <w:p>
+      <w:pPr>
+        <w:spacing w:after="40"/>
+      </w:pPr>
+    </w:p>
+    <w:tbl>
+      <w:tblPr>
+        <w:tblW w:type="auto" w:w="0"/>
+        <w:tblLook w:firstColumn="1" w:firstRow="1" w:lastColumn="0" w:lastRow="0" w:noHBand="0" w:noVBand="1" w:val="04A0"/>
+      </w:tblPr>
+      <w:tblGrid>
+        <w:gridCol w:w="10200"/>
+      </w:tblGrid>
+      <w:tr>
+        <w:tc>
+          <w:tcPr>
+            <w:tcW w:type="dxa" w:w="10200"/>
+            <w:shd w:val="clear" w:color="auto" w:fill="F39300"/>
+            <w:tcBorders>
+              <w:top w:val="single" w:sz="4" w:color="F39300"/>
+              <w:left w:val="single" w:sz="4" w:color="F39300"/>
+              <w:bottom w:val="single" w:sz="4" w:color="F39300"/>
+              <w:right w:val="single" w:sz="4" w:color="F39300"/>
+            </w:tcBorders>
+          </w:tcPr>
+          <w:p>
+            <w:r>
+              <w:rPr>
+                <w:b/>
+                <w:color w:val="FFFFFF"/>
+                <w:sz w:val="22"/>
+              </w:rPr>
+              <w:t>3. Criterio de cierre</w:t>
+            </w:r>
+          </w:p>
+        </w:tc>
+      </w:tr>
+    </w:tbl>
+    <w:tbl>
+      <w:tblPr>
+        <w:tblW w:type="auto" w:w="0"/>
+        <w:tblLook w:firstColumn="1" w:firstRow="1" w:lastColumn="0" w:lastRow="0" w:noHBand="0" w:noVBand="1" w:val="04A0"/>
+      </w:tblPr>
+      <w:tblGrid>
+        <w:gridCol w:w="10200"/>
+      </w:tblGrid>
+      <w:tr>
+        <w:tc>
+          <w:tcPr>
+            <w:tcW w:type="dxa" w:w="10200"/>
+            <w:tcBorders>
+              <w:top w:val="single" w:sz="4" w:color="F39300"/>
+              <w:left w:val="single" w:sz="4" w:color="F39300"/>
+              <w:bottom w:val="single" w:sz="4" w:color="F39300"/>
+              <w:right w:val="single" w:sz="4" w:color="F39300"/>
+            </w:tcBorders>
+          </w:tcPr>
+          <w:p>
+            <w:r>
+              <w:rPr>
+                <w:i/>
+                <w:color w:val="888888"/>
+                <w:sz w:val="19"/>
+              </w:rPr>
+              <w:t>¿Cómo sabés que el problema quedó resuelto?</w:t>
+            </w:r>
+          </w:p>
+          <w:p>
+            <w:pPr>
+              <w:spacing w:after="40"/>
+            </w:pPr>
+          </w:p>
+          <w:p>
+            <w:pPr>
+              <w:spacing w:after="40"/>
+            </w:pPr>
+          </w:p>
+        </w:tc>
+      </w:tr>
+    </w:tbl>
+    <w:p>
+      <w:pPr>
+        <w:spacing w:after="40"/>
+      </w:pPr>
+    </w:p>
+    <w:tbl>
+      <w:tblPr>
+        <w:tblW w:type="auto" w:w="0"/>
+        <w:tblLook w:firstColumn="1" w:firstRow="1" w:lastColumn="0" w:lastRow="0" w:noHBand="0" w:noVBand="1" w:val="04A0"/>
+      </w:tblPr>
+      <w:tblGrid>
+        <w:gridCol w:w="10200"/>
+      </w:tblGrid>
+      <w:tr>
+        <w:tc>
+          <w:tcPr>
+            <w:tcW w:type="dxa" w:w="10200"/>
+            <w:shd w:val="clear" w:color="auto" w:fill="F39300"/>
+            <w:tcBorders>
+              <w:top w:val="single" w:sz="4" w:color="F39300"/>
+              <w:left w:val="single" w:sz="4" w:color="F39300"/>
+              <w:bottom w:val="single" w:sz="4" w:color="F39300"/>
+              <w:right w:val="single" w:sz="4" w:color="F39300"/>
+            </w:tcBorders>
+          </w:tcPr>
+          <w:p>
+            <w:r>
+              <w:rPr>
+                <w:b/>
+                <w:color w:val="FFFFFF"/>
+                <w:sz w:val="22"/>
+              </w:rPr>
+              <w:t>4. Cuándo escalar al equipo EMC</w:t>
+            </w:r>
+          </w:p>
+        </w:tc>
+      </w:tr>
+    </w:tbl>
+    <w:tbl>
+      <w:tblPr>
+        <w:tblW w:type="auto" w:w="0"/>
+        <w:tblLook w:firstColumn="1" w:firstRow="1" w:lastColumn="0" w:lastRow="0" w:noHBand="0" w:noVBand="1" w:val="04A0"/>
+      </w:tblPr>
+      <w:tblGrid>
+        <w:gridCol w:w="10200"/>
+      </w:tblGrid>
+      <w:tr>
+        <w:tc>
+          <w:tcPr>
+            <w:tcW w:type="dxa" w:w="10200"/>
+            <w:tcBorders>
+              <w:top w:val="single" w:sz="4" w:color="F39300"/>
+              <w:left w:val="single" w:sz="4" w:color="F39300"/>
+              <w:bottom w:val="single" w:sz="4" w:color="F39300"/>
+              <w:right w:val="single" w:sz="4" w:color="F39300"/>
+            </w:tcBorders>
+          </w:tcPr>
+          <w:p>
+            <w:r>
+              <w:rPr>
+                <w:i/>
+                <w:color w:val="888888"/>
+                <w:sz w:val="19"/>
+              </w:rPr>
+              <w:t>¿En qué condiciones este protocolo no alcanza y hay que escalar a eligiendomicamino@worldbank.org?</w:t>
+            </w:r>
+          </w:p>
+          <w:p>
+            <w:pPr>
+              <w:spacing w:after="40"/>
+            </w:pPr>
+          </w:p>
+          <w:p>
+            <w:pPr>
+              <w:spacing w:after="40"/>
+            </w:pPr>
+          </w:p>
+        </w:tc>
+      </w:tr>
+    </w:tbl>
+    <w:p>
+      <w:pPr>
+        <w:spacing w:after="40"/>
+      </w:pPr>
+    </w:p>
+    <w:p>
+      <w:pPr>
+        <w:jc w:val="center"/>
+      </w:pPr>
+      <w:r>
+        <w:rPr>
+          <w:i/>
+          <w:color w:val="666666"/>
+          <w:sz w:val="18"/>
+        </w:rPr>
+        <w:t>📩 Enviar los 5 protocolos a: eligiendomicamino@worldbank.org   |   Mínimo 4 de 5 para aprobar este componente   |   Página 4 de 5</w:t>
+      </w:r>
+    </w:p>
+    <w:p>
+      <w:r>
+        <w:br w:type="page"/>
+      </w:r>
+    </w:p>
+    <w:tbl>
+      <w:tblPr>
+        <w:tblW w:type="auto" w:w="0"/>
+        <w:jc w:val="center"/>
+        <w:tblLook w:firstColumn="1" w:firstRow="1" w:lastColumn="0" w:lastRow="0" w:noHBand="0" w:noVBand="1" w:val="04A0"/>
+      </w:tblPr>
+      <w:tblGrid>
+        <w:gridCol w:w="10200"/>
+      </w:tblGrid>
+      <w:tr>
+        <w:tc>
+          <w:tcPr>
+            <w:tcW w:type="dxa" w:w="10200"/>
+            <w:shd w:val="clear" w:color="auto" w:fill="F39300"/>
+          </w:tcPr>
+          <w:p>
+            <w:pPr>
+              <w:jc w:val="center"/>
+            </w:pPr>
+            <w:r>
+              <w:rPr>
+                <w:b/>
+                <w:color w:val="FFFFFF"/>
+                <w:sz w:val="26"/>
+              </w:rPr>
+              <w:t>FORMATO DE REGISTRO DE INCIDENCIAS TÉCNICAS</w:t>
+            </w:r>
+          </w:p>
+          <w:p>
+            <w:pPr>
+              <w:jc w:val="center"/>
+            </w:pPr>
+            <w:r>
+              <w:rPr>
+                <w:i/>
+                <w:color w:val="FFFFFF"/>
+                <w:sz w:val="20"/>
+              </w:rPr>
+              <w:t>Programa Eligiendo Mi Camino — Coordinador AIP/PIP   ·   Protocolo 5 de 5: Escalamiento al equipo EMC</w:t>
+            </w:r>
+          </w:p>
+        </w:tc>
+      </w:tr>
+    </w:tbl>
+    <w:p>
+      <w:pPr>
+        <w:spacing w:after="80"/>
+      </w:pPr>
+    </w:p>
+    <w:tbl>
+      <w:tblPr>
+        <w:tblW w:type="auto" w:w="0"/>
+        <w:tblLayout w:type="fixed"/>
+        <w:tblLook w:firstColumn="1" w:firstRow="1" w:lastColumn="0" w:lastRow="0" w:noHBand="0" w:noVBand="1" w:val="04A0"/>
+      </w:tblPr>
+      <w:tblGrid>
+        <w:gridCol w:w="1474"/>
+        <w:gridCol w:w="3628"/>
+        <w:gridCol w:w="1474"/>
+        <w:gridCol w:w="3061"/>
+      </w:tblGrid>
+      <w:tr>
+        <w:tc>
+          <w:tcPr>
+            <w:tcW w:type="dxa" w:w="2550"/>
+            <w:shd w:val="clear" w:color="auto" w:fill="FFFAEB"/>
+            <w:tcBorders>
+              <w:top w:val="single" w:sz="4" w:color="CCCCCC"/>
+              <w:left w:val="single" w:sz="4" w:color="CCCCCC"/>
+              <w:bottom w:val="single" w:sz="4" w:color="CCCCCC"/>
+              <w:right w:val="single" w:sz="4" w:color="CCCCCC"/>
+            </w:tcBorders>
+          </w:tcPr>
+          <w:p>
+            <w:r>
+              <w:rPr>
+                <w:b/>
+                <w:color w:val="F75A00"/>
+                <w:sz w:val="19"/>
+              </w:rPr>
+              <w:t>Protocolo #</w:t>
+            </w:r>
+          </w:p>
+        </w:tc>
+        <w:tc>
+          <w:tcPr>
+            <w:tcW w:type="dxa" w:w="2550"/>
+            <w:tcBorders>
+              <w:top w:val="single" w:sz="4" w:color="CCCCCC"/>
+              <w:left w:val="single" w:sz="4" w:color="CCCCCC"/>
+              <w:bottom w:val="single" w:sz="4" w:color="CCCCCC"/>
+              <w:right w:val="single" w:sz="4" w:color="CCCCCC"/>
+            </w:tcBorders>
+          </w:tcPr>
+          <w:p>
+            <w:r>
+              <w:rPr>
+                <w:sz w:val="20"/>
+              </w:rPr>
+              <w:t>5</w:t>
+            </w:r>
+          </w:p>
+        </w:tc>
+        <w:tc>
+          <w:tcPr>
+            <w:tcW w:type="dxa" w:w="2550"/>
+            <w:shd w:val="clear" w:color="auto" w:fill="FFFAEB"/>
+            <w:tcBorders>
+              <w:top w:val="single" w:sz="4" w:color="CCCCCC"/>
+              <w:left w:val="single" w:sz="4" w:color="CCCCCC"/>
+              <w:bottom w:val="single" w:sz="4" w:color="CCCCCC"/>
+              <w:right w:val="single" w:sz="4" w:color="CCCCCC"/>
+            </w:tcBorders>
+          </w:tcPr>
+          <w:p>
+            <w:r>
+              <w:rPr>
+                <w:b/>
+                <w:color w:val="F75A00"/>
+                <w:sz w:val="19"/>
+              </w:rPr>
+              <w:t>Categoría</w:t>
+            </w:r>
+          </w:p>
+        </w:tc>
+        <w:tc>
+          <w:tcPr>
+            <w:tcW w:type="dxa" w:w="2550"/>
+            <w:tcBorders>
+              <w:top w:val="single" w:sz="4" w:color="CCCCCC"/>
+              <w:left w:val="single" w:sz="4" w:color="CCCCCC"/>
+              <w:bottom w:val="single" w:sz="4" w:color="CCCCCC"/>
+              <w:right w:val="single" w:sz="4" w:color="CCCCCC"/>
+            </w:tcBorders>
+          </w:tcPr>
+          <w:p>
+            <w:r>
+              <w:rPr>
+                <w:sz w:val="20"/>
+              </w:rPr>
+              <w:t>☐ Conectividad   ☐ Accesos/Contraseñas   ☐ Equipos   ☐ Evaluaciones   ☑ Escalamiento</w:t>
+            </w:r>
+          </w:p>
+        </w:tc>
+      </w:tr>
+      <w:tr>
+        <w:tc>
+          <w:tcPr>
+            <w:tcW w:type="dxa" w:w="2550"/>
+            <w:shd w:val="clear" w:color="auto" w:fill="FFFAEB"/>
+            <w:tcBorders>
+              <w:top w:val="single" w:sz="4" w:color="CCCCCC"/>
+              <w:left w:val="single" w:sz="4" w:color="CCCCCC"/>
+              <w:bottom w:val="single" w:sz="4" w:color="CCCCCC"/>
+              <w:right w:val="single" w:sz="4" w:color="CCCCCC"/>
+            </w:tcBorders>
+          </w:tcPr>
+          <w:p>
+            <w:r>
+              <w:rPr>
+                <w:b/>
+                <w:color w:val="F75A00"/>
+                <w:sz w:val="19"/>
+              </w:rPr>
+              <w:t>IE</w:t>
+            </w:r>
+          </w:p>
+        </w:tc>
+        <w:tc>
+          <w:tcPr>
+            <w:tcW w:type="dxa" w:w="2550"/>
+            <w:tcBorders>
+              <w:top w:val="single" w:sz="4" w:color="CCCCCC"/>
+              <w:left w:val="single" w:sz="4" w:color="CCCCCC"/>
+              <w:bottom w:val="single" w:sz="4" w:color="CCCCCC"/>
+              <w:right w:val="single" w:sz="4" w:color="CCCCCC"/>
+            </w:tcBorders>
+          </w:tcPr>
+          <w:p>
+            <w:r>
+              <w:rPr>
+                <w:sz w:val="20"/>
+              </w:rPr>
+            </w:r>
+          </w:p>
+        </w:tc>
+        <w:tc>
+          <w:tcPr>
+            <w:tcW w:type="dxa" w:w="2550"/>
+            <w:shd w:val="clear" w:color="auto" w:fill="FFFAEB"/>
+            <w:tcBorders>
+              <w:top w:val="single" w:sz="4" w:color="CCCCCC"/>
+              <w:left w:val="single" w:sz="4" w:color="CCCCCC"/>
+              <w:bottom w:val="single" w:sz="4" w:color="CCCCCC"/>
+              <w:right w:val="single" w:sz="4" w:color="CCCCCC"/>
+            </w:tcBorders>
+          </w:tcPr>
+          <w:p>
+            <w:r>
+              <w:rPr>
+                <w:b/>
+                <w:color w:val="F75A00"/>
+                <w:sz w:val="19"/>
+              </w:rPr>
+              <w:t>Coordinador AIP/PIP</w:t>
+            </w:r>
+          </w:p>
+        </w:tc>
+        <w:tc>
+          <w:tcPr>
+            <w:tcW w:type="dxa" w:w="2550"/>
+            <w:tcBorders>
+              <w:top w:val="single" w:sz="4" w:color="CCCCCC"/>
+              <w:left w:val="single" w:sz="4" w:color="CCCCCC"/>
+              <w:bottom w:val="single" w:sz="4" w:color="CCCCCC"/>
+              <w:right w:val="single" w:sz="4" w:color="CCCCCC"/>
+            </w:tcBorders>
+          </w:tcPr>
+          <w:p>
+            <w:r>
+              <w:rPr>
+                <w:sz w:val="20"/>
+              </w:rPr>
+            </w:r>
+          </w:p>
+        </w:tc>
+      </w:tr>
+    </w:tbl>
+    <w:tbl>
+      <w:tblPr>
+        <w:tblW w:type="auto" w:w="0"/>
+        <w:tblLook w:firstColumn="1" w:firstRow="1" w:lastColumn="0" w:lastRow="0" w:noHBand="0" w:noVBand="1" w:val="04A0"/>
+      </w:tblPr>
+      <w:tblGrid>
+        <w:gridCol w:w="1474"/>
+        <w:gridCol w:w="8164"/>
+      </w:tblGrid>
+      <w:tr>
+        <w:tc>
+          <w:tcPr>
+            <w:tcW w:type="dxa" w:w="5100"/>
+            <w:shd w:val="clear" w:color="auto" w:fill="FFFAEB"/>
+            <w:tcBorders>
+              <w:top w:val="single" w:sz="4" w:color="CCCCCC"/>
+              <w:left w:val="single" w:sz="4" w:color="CCCCCC"/>
+              <w:bottom w:val="single" w:sz="4" w:color="CCCCCC"/>
+              <w:right w:val="single" w:sz="4" w:color="CCCCCC"/>
+            </w:tcBorders>
+          </w:tcPr>
+          <w:p>
+            <w:r>
+              <w:rPr>
+                <w:b/>
+                <w:color w:val="F75A00"/>
+                <w:sz w:val="19"/>
+              </w:rPr>
+              <w:t>Fecha</w:t>
+            </w:r>
+          </w:p>
+        </w:tc>
+        <w:tc>
+          <w:tcPr>
+            <w:tcW w:type="dxa" w:w="5100"/>
+            <w:tcBorders>
+              <w:top w:val="single" w:sz="4" w:color="CCCCCC"/>
+              <w:left w:val="single" w:sz="4" w:color="CCCCCC"/>
+              <w:bottom w:val="single" w:sz="4" w:color="CCCCCC"/>
+              <w:right w:val="single" w:sz="4" w:color="CCCCCC"/>
+            </w:tcBorders>
+          </w:tcPr>
+          <w:p/>
+        </w:tc>
+      </w:tr>
+    </w:tbl>
+    <w:p>
+      <w:pPr>
+        <w:spacing w:after="40"/>
+      </w:pPr>
+    </w:p>
+    <w:tbl>
+      <w:tblPr>
+        <w:tblW w:type="auto" w:w="0"/>
+        <w:tblLook w:firstColumn="1" w:firstRow="1" w:lastColumn="0" w:lastRow="0" w:noHBand="0" w:noVBand="1" w:val="04A0"/>
+      </w:tblPr>
+      <w:tblGrid>
+        <w:gridCol w:w="10200"/>
+      </w:tblGrid>
+      <w:tr>
+        <w:tc>
+          <w:tcPr>
+            <w:tcW w:type="dxa" w:w="10200"/>
+            <w:shd w:val="clear" w:color="auto" w:fill="F39300"/>
+            <w:tcBorders>
+              <w:top w:val="single" w:sz="4" w:color="F39300"/>
+              <w:left w:val="single" w:sz="4" w:color="F39300"/>
+              <w:bottom w:val="single" w:sz="4" w:color="F39300"/>
+              <w:right w:val="single" w:sz="4" w:color="F39300"/>
+            </w:tcBorders>
+          </w:tcPr>
+          <w:p>
+            <w:r>
+              <w:rPr>
+                <w:b/>
+                <w:color w:val="FFFFFF"/>
+                <w:sz w:val="22"/>
+              </w:rPr>
+              <w:t>1. Situación / problema típico</w:t>
+            </w:r>
+          </w:p>
+        </w:tc>
+      </w:tr>
+    </w:tbl>
+    <w:tbl>
+      <w:tblPr>
+        <w:tblW w:type="auto" w:w="0"/>
+        <w:tblLook w:firstColumn="1" w:firstRow="1" w:lastColumn="0" w:lastRow="0" w:noHBand="0" w:noVBand="1" w:val="04A0"/>
+      </w:tblPr>
+      <w:tblGrid>
+        <w:gridCol w:w="10200"/>
+      </w:tblGrid>
+      <w:tr>
+        <w:tc>
+          <w:tcPr>
+            <w:tcW w:type="dxa" w:w="10200"/>
+            <w:tcBorders>
+              <w:top w:val="single" w:sz="4" w:color="F39300"/>
+              <w:left w:val="single" w:sz="4" w:color="F39300"/>
+              <w:bottom w:val="single" w:sz="4" w:color="F39300"/>
+              <w:right w:val="single" w:sz="4" w:color="F39300"/>
+            </w:tcBorders>
+          </w:tcPr>
+          <w:p>
+            <w:r>
+              <w:rPr>
+                <w:i/>
+                <w:color w:val="888888"/>
+                <w:sz w:val="19"/>
+              </w:rPr>
+              <w:t>Ejemplo de esta categoría: Casos que excedan tu rol de coordinador AIP/PIP: bloqueos masivos de cuentas, cambios estructurales en la plataforma, dudas pedagógicas que pasan a tu facilitador EMC, o cualquier situación que no se resuelva con los 4 protocolos anteriores.</w:t>
+              <w:br/>
+              <w:t>Describí brevemente la situación o el problema técnico que cubre este protocolo. ¿Qué pasa? ¿Cuándo aparece? ¿A qué afecta?</w:t>
+            </w:r>
+          </w:p>
+          <w:p>
+            <w:pPr>
+              <w:spacing w:after="40"/>
+            </w:pPr>
+          </w:p>
+          <w:p>
+            <w:pPr>
+              <w:spacing w:after="40"/>
+            </w:pPr>
+          </w:p>
+        </w:tc>
+      </w:tr>
+    </w:tbl>
+    <w:p>
+      <w:pPr>
+        <w:spacing w:after="40"/>
+      </w:pPr>
+    </w:p>
+    <w:tbl>
+      <w:tblPr>
+        <w:tblW w:type="auto" w:w="0"/>
+        <w:tblLook w:firstColumn="1" w:firstRow="1" w:lastColumn="0" w:lastRow="0" w:noHBand="0" w:noVBand="1" w:val="04A0"/>
+      </w:tblPr>
+      <w:tblGrid>
+        <w:gridCol w:w="10200"/>
+      </w:tblGrid>
+      <w:tr>
+        <w:tc>
+          <w:tcPr>
+            <w:tcW w:type="dxa" w:w="10200"/>
+            <w:shd w:val="clear" w:color="auto" w:fill="F39300"/>
+            <w:tcBorders>
+              <w:top w:val="single" w:sz="4" w:color="F39300"/>
+              <w:left w:val="single" w:sz="4" w:color="F39300"/>
+              <w:bottom w:val="single" w:sz="4" w:color="F39300"/>
+              <w:right w:val="single" w:sz="4" w:color="F39300"/>
+            </w:tcBorders>
+          </w:tcPr>
+          <w:p>
+            <w:r>
+              <w:rPr>
+                <w:b/>
+                <w:color w:val="FFFFFF"/>
+                <w:sz w:val="22"/>
+              </w:rPr>
+              <w:t>2. Pasos para resolverlo</w:t>
+            </w:r>
+          </w:p>
+        </w:tc>
+      </w:tr>
+    </w:tbl>
+    <w:tbl>
+      <w:tblPr>
+        <w:tblW w:type="auto" w:w="0"/>
+        <w:tblLook w:firstColumn="1" w:firstRow="1" w:lastColumn="0" w:lastRow="0" w:noHBand="0" w:noVBand="1" w:val="04A0"/>
+      </w:tblPr>
+      <w:tblGrid>
+        <w:gridCol w:w="10200"/>
+      </w:tblGrid>
+      <w:tr>
+        <w:tc>
+          <w:tcPr>
+            <w:tcW w:type="dxa" w:w="10200"/>
+            <w:tcBorders>
+              <w:top w:val="single" w:sz="4" w:color="F39300"/>
+              <w:left w:val="single" w:sz="4" w:color="F39300"/>
+              <w:bottom w:val="single" w:sz="4" w:color="F39300"/>
+              <w:right w:val="single" w:sz="4" w:color="F39300"/>
+            </w:tcBorders>
+          </w:tcPr>
+          <w:p>
+            <w:r>
+              <w:rPr>
+                <w:i/>
+                <w:color w:val="888888"/>
+                <w:sz w:val="19"/>
+              </w:rPr>
+              <w:t>Enumerá los pasos concretos, en orden. Sé específico: qué clic, qué cable, qué comprobar.</w:t>
+              <w:br/>
+              <w:br/>
+              <w:t xml:space="preserve">1. </w:t>
+              <w:br/>
+              <w:t xml:space="preserve">2. </w:t>
+              <w:br/>
+              <w:t xml:space="preserve">3. </w:t>
+              <w:br/>
+              <w:t xml:space="preserve">4. </w:t>
+              <w:br/>
+              <w:t xml:space="preserve">5. </w:t>
+            </w:r>
+          </w:p>
+          <w:p>
+            <w:pPr>
+              <w:spacing w:after="40"/>
+            </w:pPr>
+          </w:p>
+          <w:p>
+            <w:pPr>
+              <w:spacing w:after="40"/>
+            </w:pPr>
+          </w:p>
+        </w:tc>
+      </w:tr>
+    </w:tbl>
+    <w:p>
+      <w:pPr>
+        <w:spacing w:after="40"/>
+      </w:pPr>
+    </w:p>
+    <w:tbl>
+      <w:tblPr>
+        <w:tblW w:type="auto" w:w="0"/>
+        <w:tblLook w:firstColumn="1" w:firstRow="1" w:lastColumn="0" w:lastRow="0" w:noHBand="0" w:noVBand="1" w:val="04A0"/>
+      </w:tblPr>
+      <w:tblGrid>
+        <w:gridCol w:w="10200"/>
+      </w:tblGrid>
+      <w:tr>
+        <w:tc>
+          <w:tcPr>
+            <w:tcW w:type="dxa" w:w="10200"/>
+            <w:shd w:val="clear" w:color="auto" w:fill="F39300"/>
+            <w:tcBorders>
+              <w:top w:val="single" w:sz="4" w:color="F39300"/>
+              <w:left w:val="single" w:sz="4" w:color="F39300"/>
+              <w:bottom w:val="single" w:sz="4" w:color="F39300"/>
+              <w:right w:val="single" w:sz="4" w:color="F39300"/>
+            </w:tcBorders>
+          </w:tcPr>
+          <w:p>
+            <w:r>
+              <w:rPr>
+                <w:b/>
+                <w:color w:val="FFFFFF"/>
+                <w:sz w:val="22"/>
+              </w:rPr>
+              <w:t>3. Criterio de cierre</w:t>
+            </w:r>
+          </w:p>
+        </w:tc>
+      </w:tr>
+    </w:tbl>
+    <w:tbl>
+      <w:tblPr>
+        <w:tblW w:type="auto" w:w="0"/>
+        <w:tblLook w:firstColumn="1" w:firstRow="1" w:lastColumn="0" w:lastRow="0" w:noHBand="0" w:noVBand="1" w:val="04A0"/>
+      </w:tblPr>
+      <w:tblGrid>
+        <w:gridCol w:w="10200"/>
+      </w:tblGrid>
+      <w:tr>
+        <w:tc>
+          <w:tcPr>
+            <w:tcW w:type="dxa" w:w="10200"/>
+            <w:tcBorders>
+              <w:top w:val="single" w:sz="4" w:color="F39300"/>
+              <w:left w:val="single" w:sz="4" w:color="F39300"/>
+              <w:bottom w:val="single" w:sz="4" w:color="F39300"/>
+              <w:right w:val="single" w:sz="4" w:color="F39300"/>
+            </w:tcBorders>
+          </w:tcPr>
+          <w:p>
+            <w:r>
+              <w:rPr>
+                <w:i/>
+                <w:color w:val="888888"/>
+                <w:sz w:val="19"/>
+              </w:rPr>
+              <w:t>¿Cómo sabés que el problema quedó resuelto?</w:t>
+            </w:r>
+          </w:p>
+          <w:p>
+            <w:pPr>
+              <w:spacing w:after="40"/>
+            </w:pPr>
+          </w:p>
+          <w:p>
+            <w:pPr>
+              <w:spacing w:after="40"/>
+            </w:pPr>
+          </w:p>
+        </w:tc>
+      </w:tr>
+    </w:tbl>
+    <w:p>
+      <w:pPr>
+        <w:spacing w:after="40"/>
+      </w:pPr>
+    </w:p>
+    <w:tbl>
+      <w:tblPr>
+        <w:tblW w:type="auto" w:w="0"/>
+        <w:tblLook w:firstColumn="1" w:firstRow="1" w:lastColumn="0" w:lastRow="0" w:noHBand="0" w:noVBand="1" w:val="04A0"/>
+      </w:tblPr>
+      <w:tblGrid>
+        <w:gridCol w:w="10200"/>
+      </w:tblGrid>
+      <w:tr>
+        <w:tc>
+          <w:tcPr>
+            <w:tcW w:type="dxa" w:w="10200"/>
+            <w:shd w:val="clear" w:color="auto" w:fill="F39300"/>
+            <w:tcBorders>
+              <w:top w:val="single" w:sz="4" w:color="F39300"/>
+              <w:left w:val="single" w:sz="4" w:color="F39300"/>
+              <w:bottom w:val="single" w:sz="4" w:color="F39300"/>
+              <w:right w:val="single" w:sz="4" w:color="F39300"/>
+            </w:tcBorders>
+          </w:tcPr>
+          <w:p>
+            <w:r>
+              <w:rPr>
+                <w:b/>
+                <w:color w:val="FFFFFF"/>
+                <w:sz w:val="22"/>
+              </w:rPr>
+              <w:t>4. Cuándo escalar al equipo EMC</w:t>
+            </w:r>
+          </w:p>
+        </w:tc>
+      </w:tr>
+    </w:tbl>
+    <w:tbl>
+      <w:tblPr>
+        <w:tblW w:type="auto" w:w="0"/>
+        <w:tblLook w:firstColumn="1" w:firstRow="1" w:lastColumn="0" w:lastRow="0" w:noHBand="0" w:noVBand="1" w:val="04A0"/>
+      </w:tblPr>
+      <w:tblGrid>
+        <w:gridCol w:w="10200"/>
+      </w:tblGrid>
+      <w:tr>
+        <w:tc>
+          <w:tcPr>
+            <w:tcW w:type="dxa" w:w="10200"/>
+            <w:tcBorders>
+              <w:top w:val="single" w:sz="4" w:color="F39300"/>
+              <w:left w:val="single" w:sz="4" w:color="F39300"/>
+              <w:bottom w:val="single" w:sz="4" w:color="F39300"/>
+              <w:right w:val="single" w:sz="4" w:color="F39300"/>
+            </w:tcBorders>
+          </w:tcPr>
+          <w:p>
+            <w:r>
+              <w:rPr>
+                <w:i/>
+                <w:color w:val="888888"/>
+                <w:sz w:val="19"/>
+              </w:rPr>
+              <w:t>¿En qué condiciones este protocolo no alcanza y hay que escalar a eligiendomicamino@worldbank.org?</w:t>
+            </w:r>
+          </w:p>
+          <w:p>
+            <w:pPr>
+              <w:spacing w:after="40"/>
+            </w:pPr>
+          </w:p>
+          <w:p>
+            <w:pPr>
+              <w:spacing w:after="40"/>
+            </w:pPr>
+          </w:p>
+        </w:tc>
+      </w:tr>
+    </w:tbl>
+    <w:p>
+      <w:pPr>
+        <w:spacing w:after="40"/>
+      </w:pPr>
+    </w:p>
+    <w:p>
+      <w:pPr>
+        <w:jc w:val="center"/>
+      </w:pPr>
+      <w:r>
+        <w:rPr>
+          <w:i/>
+          <w:color w:val="666666"/>
+          <w:sz w:val="18"/>
+        </w:rPr>
+        <w:t>📩 Enviar los 5 protocolos a: eligiendomicamino@worldbank.org   |   Mínimo 4 de 5 para aprobar este componente   |   Página 5 de 5</w:t>
       </w:r>
     </w:p>
     <w:sectPr>

</xml_diff>